<commit_message>
Rescue Progress (Findings 01-07): Hardcoded Session Secret; Missing Authentication; IDOR / Row-Level Ownership; Plaintext Passwords; Invoice Input Validation; Silent Failures; Missing Loading, Empty & Success States
</commit_message>
<xml_diff>
--- a/docs/Rescue Report.docx
+++ b/docs/Rescue Report.docx
@@ -4719,6 +4719,448 @@
       </w:r>
     </w:p>
     <w:p/>
+    <w:p>
+      <w:pPr>
+        <w:rPr>
+          <w:b/>
+          <w:bCs/>
+        </w:rPr>
+      </w:pPr>
+      <w:r>
+        <w:rPr>
+          <w:b/>
+          <w:bCs/>
+        </w:rPr>
+        <w:t>Finding 07: No Loading, Empty, or Success States</w:t>
+      </w:r>
+    </w:p>
+    <w:p>
+      <w:r>
+        <w:rPr>
+          <w:b/>
+          <w:bCs/>
+        </w:rPr>
+        <w:t>Severity:</w:t>
+      </w:r>
+      <w:r>
+        <w:t xml:space="preserve"> Medium</w:t>
+      </w:r>
+      <w:r>
+        <w:br/>
+      </w:r>
+      <w:r>
+        <w:rPr>
+          <w:b/>
+          <w:bCs/>
+        </w:rPr>
+        <w:t>Category:</w:t>
+      </w:r>
+      <w:r>
+        <w:t xml:space="preserve"> Inconsistent Behavior / User Experience</w:t>
+      </w:r>
+      <w:r>
+        <w:br/>
+      </w:r>
+      <w:r>
+        <w:rPr>
+          <w:b/>
+          <w:bCs/>
+        </w:rPr>
+        <w:t>Status:</w:t>
+      </w:r>
+      <w:r>
+        <w:t xml:space="preserve"> Partially Remediated — Existing UI States Verified; Remaining UX Gaps Identified</w:t>
+      </w:r>
+    </w:p>
+    <w:p>
+      <w:pPr>
+        <w:rPr>
+          <w:b/>
+          <w:bCs/>
+        </w:rPr>
+      </w:pPr>
+      <w:r>
+        <w:rPr>
+          <w:b/>
+          <w:bCs/>
+        </w:rPr>
+        <w:t>1. Original Issue</w:t>
+      </w:r>
+    </w:p>
+    <w:p>
+      <w:r>
+        <w:t>The application lacked consistent user feedback during loading, empty data, and successful operations. Users could encounter blank list pages, unclear waiting periods, or uncertainty about whether an operation had completed.</w:t>
+      </w:r>
+    </w:p>
+    <w:p>
+      <w:pPr>
+        <w:rPr>
+          <w:b/>
+          <w:bCs/>
+        </w:rPr>
+      </w:pPr>
+      <w:r>
+        <w:rPr>
+          <w:b/>
+          <w:bCs/>
+        </w:rPr>
+        <w:t>2. Why It Was Risky</w:t>
+      </w:r>
+    </w:p>
+    <w:p>
+      <w:pPr>
+        <w:numPr>
+          <w:ilvl w:val="0"/>
+          <w:numId w:val="18"/>
+        </w:numPr>
+      </w:pPr>
+      <w:r>
+        <w:rPr>
+          <w:b/>
+          <w:bCs/>
+        </w:rPr>
+        <w:t>Poor user experience:</w:t>
+      </w:r>
+      <w:r>
+        <w:t xml:space="preserve"> Blank pages can make the application appear broken or unresponsive.</w:t>
+      </w:r>
+    </w:p>
+    <w:p>
+      <w:pPr>
+        <w:numPr>
+          <w:ilvl w:val="0"/>
+          <w:numId w:val="18"/>
+        </w:numPr>
+      </w:pPr>
+      <w:r>
+        <w:rPr>
+          <w:b/>
+          <w:bCs/>
+        </w:rPr>
+        <w:t>User confusion:</w:t>
+      </w:r>
+      <w:r>
+        <w:t xml:space="preserve"> Users may not know whether data is loading or whether a list is empty.</w:t>
+      </w:r>
+    </w:p>
+    <w:p>
+      <w:pPr>
+        <w:numPr>
+          <w:ilvl w:val="0"/>
+          <w:numId w:val="18"/>
+        </w:numPr>
+      </w:pPr>
+      <w:r>
+        <w:rPr>
+          <w:b/>
+          <w:bCs/>
+        </w:rPr>
+        <w:t>Duplicate submissions:</w:t>
+      </w:r>
+      <w:r>
+        <w:t xml:space="preserve"> Without disabling buttons during operations, users may submit the same request multiple times.</w:t>
+      </w:r>
+    </w:p>
+    <w:p>
+      <w:pPr>
+        <w:numPr>
+          <w:ilvl w:val="0"/>
+          <w:numId w:val="18"/>
+        </w:numPr>
+      </w:pPr>
+      <w:r>
+        <w:rPr>
+          <w:b/>
+          <w:bCs/>
+        </w:rPr>
+        <w:t>Unclear outcomes:</w:t>
+      </w:r>
+      <w:r>
+        <w:t xml:space="preserve"> Missing confirmation messages can leave users uncertain about successful operations.</w:t>
+      </w:r>
+    </w:p>
+    <w:p>
+      <w:pPr>
+        <w:rPr>
+          <w:b/>
+          <w:bCs/>
+        </w:rPr>
+      </w:pPr>
+      <w:r>
+        <w:rPr>
+          <w:b/>
+          <w:bCs/>
+        </w:rPr>
+        <w:t>3. Remediation and Implementation</w:t>
+      </w:r>
+    </w:p>
+    <w:p>
+      <w:r>
+        <w:t>The existing implementation was inspected and verified.</w:t>
+      </w:r>
+    </w:p>
+    <w:p>
+      <w:pPr>
+        <w:numPr>
+          <w:ilvl w:val="0"/>
+          <w:numId w:val="19"/>
+        </w:numPr>
+      </w:pPr>
+      <w:r>
+        <w:rPr>
+          <w:b/>
+          <w:bCs/>
+        </w:rPr>
+        <w:lastRenderedPageBreak/>
+        <w:t>Empty States:</w:t>
+      </w:r>
+      <w:r>
+        <w:t xml:space="preserve"> The EmptyState component is used on the Clients, Invoices, Payments, and Subscriptions list pages to explain when no records exist and provide relevant guidance or actions.</w:t>
+      </w:r>
+    </w:p>
+    <w:p>
+      <w:pPr>
+        <w:numPr>
+          <w:ilvl w:val="0"/>
+          <w:numId w:val="19"/>
+        </w:numPr>
+      </w:pPr>
+      <w:r>
+        <w:rPr>
+          <w:b/>
+          <w:bCs/>
+        </w:rPr>
+        <w:t>Loading Buttons:</w:t>
+      </w:r>
+      <w:r>
+        <w:t xml:space="preserve"> The shared Button component supports a loading prop and loadingLabel. It changes the button label and disables the button while an operation is in progress, helping prevent duplicate submissions.</w:t>
+      </w:r>
+    </w:p>
+    <w:p>
+      <w:pPr>
+        <w:numPr>
+          <w:ilvl w:val="0"/>
+          <w:numId w:val="19"/>
+        </w:numPr>
+      </w:pPr>
+      <w:r>
+        <w:rPr>
+          <w:b/>
+          <w:bCs/>
+        </w:rPr>
+        <w:t>Form Feedback:</w:t>
+      </w:r>
+      <w:r>
+        <w:t xml:space="preserve"> Client, Invoice, Subscription, and Login forms implement loading indicators through button labels and display error feedback when requests fail.</w:t>
+      </w:r>
+    </w:p>
+    <w:p>
+      <w:pPr>
+        <w:numPr>
+          <w:ilvl w:val="0"/>
+          <w:numId w:val="19"/>
+        </w:numPr>
+      </w:pPr>
+      <w:r>
+        <w:rPr>
+          <w:b/>
+          <w:bCs/>
+        </w:rPr>
+        <w:t>Invoice Action Feedback:</w:t>
+      </w:r>
+      <w:r>
+        <w:t xml:space="preserve"> Invoice actions provide loading labels for sending, voiding, and recording payments, along with error feedback.</w:t>
+      </w:r>
+    </w:p>
+    <w:p>
+      <w:pPr>
+        <w:numPr>
+          <w:ilvl w:val="0"/>
+          <w:numId w:val="19"/>
+        </w:numPr>
+      </w:pPr>
+      <w:r>
+        <w:rPr>
+          <w:b/>
+          <w:bCs/>
+        </w:rPr>
+        <w:t>Shared UI Components:</w:t>
+      </w:r>
+      <w:r>
+        <w:t xml:space="preserve"> EmptyState, Skeleton, CardSkeleton, and Feedback components are available in src/components/ui.tsx.</w:t>
+      </w:r>
+    </w:p>
+    <w:p>
+      <w:pPr>
+        <w:rPr>
+          <w:b/>
+          <w:bCs/>
+        </w:rPr>
+      </w:pPr>
+      <w:r>
+        <w:rPr>
+          <w:b/>
+          <w:bCs/>
+        </w:rPr>
+        <w:t>4. Verification and Testing</w:t>
+      </w:r>
+    </w:p>
+    <w:p>
+      <w:pPr>
+        <w:numPr>
+          <w:ilvl w:val="0"/>
+          <w:numId w:val="20"/>
+        </w:numPr>
+      </w:pPr>
+      <w:r>
+        <w:t>Inspected the Clients, Invoices, Payments, and Subscriptions list pages and confirmed their empty-state implementations.</w:t>
+      </w:r>
+    </w:p>
+    <w:p>
+      <w:pPr>
+        <w:numPr>
+          <w:ilvl w:val="0"/>
+          <w:numId w:val="20"/>
+        </w:numPr>
+      </w:pPr>
+      <w:r>
+        <w:t>Inspected Client, Invoice, Subscription, and Login forms and confirmed loading and error-handling logic.</w:t>
+      </w:r>
+    </w:p>
+    <w:p>
+      <w:pPr>
+        <w:numPr>
+          <w:ilvl w:val="0"/>
+          <w:numId w:val="20"/>
+        </w:numPr>
+      </w:pPr>
+      <w:r>
+        <w:t>Verified that the shared Button component disables itself while loading and supports changing its label.</w:t>
+      </w:r>
+    </w:p>
+    <w:p>
+      <w:pPr>
+        <w:numPr>
+          <w:ilvl w:val="0"/>
+          <w:numId w:val="20"/>
+        </w:numPr>
+      </w:pPr>
+      <w:r>
+        <w:t>Confirmed invoice actions have separate loading states.</w:t>
+      </w:r>
+    </w:p>
+    <w:p>
+      <w:pPr>
+        <w:numPr>
+          <w:ilvl w:val="0"/>
+          <w:numId w:val="20"/>
+        </w:numPr>
+      </w:pPr>
+      <w:r>
+        <w:t>Searched application routes for loading.tsx files; no route-level loading files were found under src/app/(app).</w:t>
+      </w:r>
+    </w:p>
+    <w:p>
+      <w:pPr>
+        <w:numPr>
+          <w:ilvl w:val="0"/>
+          <w:numId w:val="20"/>
+        </w:numPr>
+      </w:pPr>
+      <w:r>
+        <w:t>Searched for actual Skeleton and CardSkeleton usage; their definitions exist, but active usage was not identified in the inspected results.</w:t>
+      </w:r>
+    </w:p>
+    <w:p>
+      <w:pPr>
+        <w:numPr>
+          <w:ilvl w:val="0"/>
+          <w:numId w:val="20"/>
+        </w:numPr>
+      </w:pPr>
+      <w:r>
+        <w:t>Ran npx.cmd tsc --noEmit successfully with no TypeScript errors.</w:t>
+      </w:r>
+    </w:p>
+    <w:p>
+      <w:pPr>
+        <w:rPr>
+          <w:b/>
+          <w:bCs/>
+        </w:rPr>
+      </w:pPr>
+      <w:r>
+        <w:rPr>
+          <w:b/>
+          <w:bCs/>
+        </w:rPr>
+        <w:t>5. Remaining Gaps</w:t>
+      </w:r>
+    </w:p>
+    <w:p>
+      <w:pPr>
+        <w:numPr>
+          <w:ilvl w:val="0"/>
+          <w:numId w:val="21"/>
+        </w:numPr>
+      </w:pPr>
+      <w:r>
+        <w:t>Skeleton components are defined but are not currently used in the inspected pages.</w:t>
+      </w:r>
+    </w:p>
+    <w:p>
+      <w:pPr>
+        <w:numPr>
+          <w:ilvl w:val="0"/>
+          <w:numId w:val="21"/>
+        </w:numPr>
+      </w:pPr>
+      <w:r>
+        <w:t>Dedicated route-level loading screens are not implemented.</w:t>
+      </w:r>
+    </w:p>
+    <w:p>
+      <w:pPr>
+        <w:numPr>
+          <w:ilvl w:val="0"/>
+          <w:numId w:val="21"/>
+        </w:numPr>
+      </w:pPr>
+      <w:r>
+        <w:t>Consistent success confirmation messages across all forms and actions have not yet been verified.</w:t>
+      </w:r>
+    </w:p>
+    <w:p>
+      <w:pPr>
+        <w:rPr>
+          <w:b/>
+          <w:bCs/>
+        </w:rPr>
+      </w:pPr>
+      <w:r>
+        <w:rPr>
+          <w:b/>
+          <w:bCs/>
+        </w:rPr>
+        <w:lastRenderedPageBreak/>
+        <w:t>6. Outcome</w:t>
+      </w:r>
+    </w:p>
+    <w:p>
+      <w:r>
+        <w:t>The main empty states, form loading indicators, duplicate-submission prevention, and error feedback are already implemented. However, skeleton usage, route-level loading screens, and consistent success feedback remain areas for improvement.</w:t>
+      </w:r>
+    </w:p>
+    <w:p>
+      <w:r>
+        <w:rPr>
+          <w:b/>
+          <w:bCs/>
+        </w:rPr>
+        <w:t>Final Assessment: Partially Remediated.</w:t>
+      </w:r>
+    </w:p>
+    <w:p/>
     <w:sectPr>
       <w:pgSz w:w="12240" w:h="15840"/>
       <w:pgMar w:top="1440" w:right="1440" w:bottom="1440" w:left="1440" w:header="720" w:footer="720" w:gutter="0"/>
@@ -4732,6 +5174,155 @@
 <file path=word/numbering.xml><?xml version="1.0" encoding="utf-8"?>
 <w:numbering xmlns:wpc="http://schemas.microsoft.com/office/word/2010/wordprocessingCanvas" xmlns:cx="http://schemas.microsoft.com/office/drawing/2014/chartex" xmlns:cx1="http://schemas.microsoft.com/office/drawing/2015/9/8/chartex" xmlns:cx2="http://schemas.microsoft.com/office/drawing/2015/10/21/chartex" xmlns:cx3="http://schemas.microsoft.com/office/drawing/2016/5/9/chartex" xmlns:cx4="http://schemas.microsoft.com/office/drawing/2016/5/10/chartex" xmlns:cx5="http://schemas.microsoft.com/office/drawing/2016/5/11/chartex" xmlns:cx6="http://schemas.microsoft.com/office/drawing/2016/5/12/chartex" xmlns:cx7="http://schemas.microsoft.com/office/drawing/2016/5/13/chartex" xmlns:cx8="http://schemas.microsoft.com/office/drawing/2016/5/14/chartex" xmlns:mc="http://schemas.openxmlformats.org/markup-compatibility/2006" xmlns:aink="http://schemas.microsoft.com/office/drawing/2016/ink" xmlns:am3d="http://schemas.microsoft.com/office/drawing/2017/model3d" xmlns:o="urn:schemas-microsoft-com:office:office" xmlns:oel="http://schemas.microsoft.com/office/2019/extlst" xmlns:r="http://schemas.openxmlformats.org/officeDocument/2006/relationships" xmlns:m="http://schemas.openxmlformats.org/officeDocument/2006/math" xmlns:v="urn:schemas-microsoft-com:vml" xmlns:wp14="http://schemas.microsoft.com/office/word/2010/wordprocessingDrawing" xmlns:wp="http://schemas.openxmlformats.org/drawingml/2006/wordprocessingDrawing" xmlns:w10="urn:schemas-microsoft-com:office:word" xmlns:w="http://schemas.openxmlformats.org/wordprocessingml/2006/main" xmlns:w14="http://schemas.microsoft.com/office/word/2010/wordml" xmlns:w15="http://schemas.microsoft.com/office/word/2012/wordml" xmlns:w16cex="http://schemas.microsoft.com/office/word/2018/wordml/cex" xmlns:w16cid="http://schemas.microsoft.com/office/word/2016/wordml/cid" xmlns:w16="http://schemas.microsoft.com/office/word/2018/wordml" xmlns:w16sdtdh="http://schemas.microsoft.com/office/word/2020/wordml/sdtdatahash" xmlns:w16se="http://schemas.microsoft.com/office/word/2015/wordml/symex" xmlns:wpg="http://schemas.microsoft.com/office/word/2010/wordprocessingGroup" xmlns:wpi="http://schemas.microsoft.com/office/word/2010/wordprocessingInk" xmlns:wne="http://schemas.microsoft.com/office/word/2006/wordml" xmlns:wps="http://schemas.microsoft.com/office/word/2010/wordprocessingShape" mc:Ignorable="w14 w15 w16se w16cid w16 w16cex w16sdtdh wp14">
   <w:abstractNum w:abstractNumId="0" w15:restartNumberingAfterBreak="0">
+    <w:nsid w:val="07A730AE"/>
+    <w:multiLevelType w:val="multilevel"/>
+    <w:tmpl w:val="7D360CE6"/>
+    <w:lvl w:ilvl="0">
+      <w:start w:val="1"/>
+      <w:numFmt w:val="bullet"/>
+      <w:lvlText w:val=""/>
+      <w:lvlJc w:val="left"/>
+      <w:pPr>
+        <w:tabs>
+          <w:tab w:val="num" w:pos="720"/>
+        </w:tabs>
+        <w:ind w:left="720" w:hanging="360"/>
+      </w:pPr>
+      <w:rPr>
+        <w:rFonts w:ascii="Symbol" w:hAnsi="Symbol" w:hint="default"/>
+        <w:sz w:val="20"/>
+      </w:rPr>
+    </w:lvl>
+    <w:lvl w:ilvl="1" w:tentative="1">
+      <w:start w:val="1"/>
+      <w:numFmt w:val="bullet"/>
+      <w:lvlText w:val="o"/>
+      <w:lvlJc w:val="left"/>
+      <w:pPr>
+        <w:tabs>
+          <w:tab w:val="num" w:pos="1440"/>
+        </w:tabs>
+        <w:ind w:left="1440" w:hanging="360"/>
+      </w:pPr>
+      <w:rPr>
+        <w:rFonts w:ascii="Courier New" w:hAnsi="Courier New" w:hint="default"/>
+        <w:sz w:val="20"/>
+      </w:rPr>
+    </w:lvl>
+    <w:lvl w:ilvl="2" w:tentative="1">
+      <w:start w:val="1"/>
+      <w:numFmt w:val="bullet"/>
+      <w:lvlText w:val=""/>
+      <w:lvlJc w:val="left"/>
+      <w:pPr>
+        <w:tabs>
+          <w:tab w:val="num" w:pos="2160"/>
+        </w:tabs>
+        <w:ind w:left="2160" w:hanging="360"/>
+      </w:pPr>
+      <w:rPr>
+        <w:rFonts w:ascii="Wingdings" w:hAnsi="Wingdings" w:hint="default"/>
+        <w:sz w:val="20"/>
+      </w:rPr>
+    </w:lvl>
+    <w:lvl w:ilvl="3" w:tentative="1">
+      <w:start w:val="1"/>
+      <w:numFmt w:val="bullet"/>
+      <w:lvlText w:val=""/>
+      <w:lvlJc w:val="left"/>
+      <w:pPr>
+        <w:tabs>
+          <w:tab w:val="num" w:pos="2880"/>
+        </w:tabs>
+        <w:ind w:left="2880" w:hanging="360"/>
+      </w:pPr>
+      <w:rPr>
+        <w:rFonts w:ascii="Wingdings" w:hAnsi="Wingdings" w:hint="default"/>
+        <w:sz w:val="20"/>
+      </w:rPr>
+    </w:lvl>
+    <w:lvl w:ilvl="4" w:tentative="1">
+      <w:start w:val="1"/>
+      <w:numFmt w:val="bullet"/>
+      <w:lvlText w:val=""/>
+      <w:lvlJc w:val="left"/>
+      <w:pPr>
+        <w:tabs>
+          <w:tab w:val="num" w:pos="3600"/>
+        </w:tabs>
+        <w:ind w:left="3600" w:hanging="360"/>
+      </w:pPr>
+      <w:rPr>
+        <w:rFonts w:ascii="Wingdings" w:hAnsi="Wingdings" w:hint="default"/>
+        <w:sz w:val="20"/>
+      </w:rPr>
+    </w:lvl>
+    <w:lvl w:ilvl="5" w:tentative="1">
+      <w:start w:val="1"/>
+      <w:numFmt w:val="bullet"/>
+      <w:lvlText w:val=""/>
+      <w:lvlJc w:val="left"/>
+      <w:pPr>
+        <w:tabs>
+          <w:tab w:val="num" w:pos="4320"/>
+        </w:tabs>
+        <w:ind w:left="4320" w:hanging="360"/>
+      </w:pPr>
+      <w:rPr>
+        <w:rFonts w:ascii="Wingdings" w:hAnsi="Wingdings" w:hint="default"/>
+        <w:sz w:val="20"/>
+      </w:rPr>
+    </w:lvl>
+    <w:lvl w:ilvl="6" w:tentative="1">
+      <w:start w:val="1"/>
+      <w:numFmt w:val="bullet"/>
+      <w:lvlText w:val=""/>
+      <w:lvlJc w:val="left"/>
+      <w:pPr>
+        <w:tabs>
+          <w:tab w:val="num" w:pos="5040"/>
+        </w:tabs>
+        <w:ind w:left="5040" w:hanging="360"/>
+      </w:pPr>
+      <w:rPr>
+        <w:rFonts w:ascii="Wingdings" w:hAnsi="Wingdings" w:hint="default"/>
+        <w:sz w:val="20"/>
+      </w:rPr>
+    </w:lvl>
+    <w:lvl w:ilvl="7" w:tentative="1">
+      <w:start w:val="1"/>
+      <w:numFmt w:val="bullet"/>
+      <w:lvlText w:val=""/>
+      <w:lvlJc w:val="left"/>
+      <w:pPr>
+        <w:tabs>
+          <w:tab w:val="num" w:pos="5760"/>
+        </w:tabs>
+        <w:ind w:left="5760" w:hanging="360"/>
+      </w:pPr>
+      <w:rPr>
+        <w:rFonts w:ascii="Wingdings" w:hAnsi="Wingdings" w:hint="default"/>
+        <w:sz w:val="20"/>
+      </w:rPr>
+    </w:lvl>
+    <w:lvl w:ilvl="8" w:tentative="1">
+      <w:start w:val="1"/>
+      <w:numFmt w:val="bullet"/>
+      <w:lvlText w:val=""/>
+      <w:lvlJc w:val="left"/>
+      <w:pPr>
+        <w:tabs>
+          <w:tab w:val="num" w:pos="6480"/>
+        </w:tabs>
+        <w:ind w:left="6480" w:hanging="360"/>
+      </w:pPr>
+      <w:rPr>
+        <w:rFonts w:ascii="Wingdings" w:hAnsi="Wingdings" w:hint="default"/>
+        <w:sz w:val="20"/>
+      </w:rPr>
+    </w:lvl>
+  </w:abstractNum>
+  <w:abstractNum w:abstractNumId="1" w15:restartNumberingAfterBreak="0">
     <w:nsid w:val="07F57651"/>
     <w:multiLevelType w:val="multilevel"/>
     <w:tmpl w:val="C78240EE"/>
@@ -4880,7 +5471,7 @@
       </w:rPr>
     </w:lvl>
   </w:abstractNum>
-  <w:abstractNum w:abstractNumId="1" w15:restartNumberingAfterBreak="0">
+  <w:abstractNum w:abstractNumId="2" w15:restartNumberingAfterBreak="0">
     <w:nsid w:val="08596C8D"/>
     <w:multiLevelType w:val="multilevel"/>
     <w:tmpl w:val="4DAAE6EC"/>
@@ -5029,7 +5620,7 @@
       </w:rPr>
     </w:lvl>
   </w:abstractNum>
-  <w:abstractNum w:abstractNumId="2" w15:restartNumberingAfterBreak="0">
+  <w:abstractNum w:abstractNumId="3" w15:restartNumberingAfterBreak="0">
     <w:nsid w:val="20A91D42"/>
     <w:multiLevelType w:val="multilevel"/>
     <w:tmpl w:val="521ED768"/>
@@ -5178,7 +5769,7 @@
       </w:rPr>
     </w:lvl>
   </w:abstractNum>
-  <w:abstractNum w:abstractNumId="3" w15:restartNumberingAfterBreak="0">
+  <w:abstractNum w:abstractNumId="4" w15:restartNumberingAfterBreak="0">
     <w:nsid w:val="2647274E"/>
     <w:multiLevelType w:val="multilevel"/>
     <w:tmpl w:val="13144B14"/>
@@ -5327,7 +5918,7 @@
       </w:rPr>
     </w:lvl>
   </w:abstractNum>
-  <w:abstractNum w:abstractNumId="4" w15:restartNumberingAfterBreak="0">
+  <w:abstractNum w:abstractNumId="5" w15:restartNumberingAfterBreak="0">
     <w:nsid w:val="336D11D6"/>
     <w:multiLevelType w:val="multilevel"/>
     <w:tmpl w:val="CB0AF25C"/>
@@ -5476,7 +6067,7 @@
       </w:rPr>
     </w:lvl>
   </w:abstractNum>
-  <w:abstractNum w:abstractNumId="5" w15:restartNumberingAfterBreak="0">
+  <w:abstractNum w:abstractNumId="6" w15:restartNumberingAfterBreak="0">
     <w:nsid w:val="34320D9D"/>
     <w:multiLevelType w:val="multilevel"/>
     <w:tmpl w:val="E14486C4"/>
@@ -5625,7 +6216,7 @@
       </w:rPr>
     </w:lvl>
   </w:abstractNum>
-  <w:abstractNum w:abstractNumId="6" w15:restartNumberingAfterBreak="0">
+  <w:abstractNum w:abstractNumId="7" w15:restartNumberingAfterBreak="0">
     <w:nsid w:val="420741C5"/>
     <w:multiLevelType w:val="multilevel"/>
     <w:tmpl w:val="ADF8951A"/>
@@ -5774,7 +6365,7 @@
       </w:rPr>
     </w:lvl>
   </w:abstractNum>
-  <w:abstractNum w:abstractNumId="7" w15:restartNumberingAfterBreak="0">
+  <w:abstractNum w:abstractNumId="8" w15:restartNumberingAfterBreak="0">
     <w:nsid w:val="456B647E"/>
     <w:multiLevelType w:val="multilevel"/>
     <w:tmpl w:val="207E01CA"/>
@@ -5923,7 +6514,120 @@
       </w:rPr>
     </w:lvl>
   </w:abstractNum>
-  <w:abstractNum w:abstractNumId="8" w15:restartNumberingAfterBreak="0">
+  <w:abstractNum w:abstractNumId="9" w15:restartNumberingAfterBreak="0">
+    <w:nsid w:val="49BC03F4"/>
+    <w:multiLevelType w:val="multilevel"/>
+    <w:tmpl w:val="AF5C059C"/>
+    <w:lvl w:ilvl="0">
+      <w:start w:val="1"/>
+      <w:numFmt w:val="decimal"/>
+      <w:lvlText w:val="%1."/>
+      <w:lvlJc w:val="left"/>
+      <w:pPr>
+        <w:tabs>
+          <w:tab w:val="num" w:pos="720"/>
+        </w:tabs>
+        <w:ind w:left="720" w:hanging="360"/>
+      </w:pPr>
+    </w:lvl>
+    <w:lvl w:ilvl="1" w:tentative="1">
+      <w:start w:val="1"/>
+      <w:numFmt w:val="decimal"/>
+      <w:lvlText w:val="%2."/>
+      <w:lvlJc w:val="left"/>
+      <w:pPr>
+        <w:tabs>
+          <w:tab w:val="num" w:pos="1440"/>
+        </w:tabs>
+        <w:ind w:left="1440" w:hanging="360"/>
+      </w:pPr>
+    </w:lvl>
+    <w:lvl w:ilvl="2" w:tentative="1">
+      <w:start w:val="1"/>
+      <w:numFmt w:val="decimal"/>
+      <w:lvlText w:val="%3."/>
+      <w:lvlJc w:val="left"/>
+      <w:pPr>
+        <w:tabs>
+          <w:tab w:val="num" w:pos="2160"/>
+        </w:tabs>
+        <w:ind w:left="2160" w:hanging="360"/>
+      </w:pPr>
+    </w:lvl>
+    <w:lvl w:ilvl="3" w:tentative="1">
+      <w:start w:val="1"/>
+      <w:numFmt w:val="decimal"/>
+      <w:lvlText w:val="%4."/>
+      <w:lvlJc w:val="left"/>
+      <w:pPr>
+        <w:tabs>
+          <w:tab w:val="num" w:pos="2880"/>
+        </w:tabs>
+        <w:ind w:left="2880" w:hanging="360"/>
+      </w:pPr>
+    </w:lvl>
+    <w:lvl w:ilvl="4" w:tentative="1">
+      <w:start w:val="1"/>
+      <w:numFmt w:val="decimal"/>
+      <w:lvlText w:val="%5."/>
+      <w:lvlJc w:val="left"/>
+      <w:pPr>
+        <w:tabs>
+          <w:tab w:val="num" w:pos="3600"/>
+        </w:tabs>
+        <w:ind w:left="3600" w:hanging="360"/>
+      </w:pPr>
+    </w:lvl>
+    <w:lvl w:ilvl="5" w:tentative="1">
+      <w:start w:val="1"/>
+      <w:numFmt w:val="decimal"/>
+      <w:lvlText w:val="%6."/>
+      <w:lvlJc w:val="left"/>
+      <w:pPr>
+        <w:tabs>
+          <w:tab w:val="num" w:pos="4320"/>
+        </w:tabs>
+        <w:ind w:left="4320" w:hanging="360"/>
+      </w:pPr>
+    </w:lvl>
+    <w:lvl w:ilvl="6" w:tentative="1">
+      <w:start w:val="1"/>
+      <w:numFmt w:val="decimal"/>
+      <w:lvlText w:val="%7."/>
+      <w:lvlJc w:val="left"/>
+      <w:pPr>
+        <w:tabs>
+          <w:tab w:val="num" w:pos="5040"/>
+        </w:tabs>
+        <w:ind w:left="5040" w:hanging="360"/>
+      </w:pPr>
+    </w:lvl>
+    <w:lvl w:ilvl="7" w:tentative="1">
+      <w:start w:val="1"/>
+      <w:numFmt w:val="decimal"/>
+      <w:lvlText w:val="%8."/>
+      <w:lvlJc w:val="left"/>
+      <w:pPr>
+        <w:tabs>
+          <w:tab w:val="num" w:pos="5760"/>
+        </w:tabs>
+        <w:ind w:left="5760" w:hanging="360"/>
+      </w:pPr>
+    </w:lvl>
+    <w:lvl w:ilvl="8" w:tentative="1">
+      <w:start w:val="1"/>
+      <w:numFmt w:val="decimal"/>
+      <w:lvlText w:val="%9."/>
+      <w:lvlJc w:val="left"/>
+      <w:pPr>
+        <w:tabs>
+          <w:tab w:val="num" w:pos="6480"/>
+        </w:tabs>
+        <w:ind w:left="6480" w:hanging="360"/>
+      </w:pPr>
+    </w:lvl>
+  </w:abstractNum>
+  <w:abstractNum w:abstractNumId="10" w15:restartNumberingAfterBreak="0">
     <w:nsid w:val="4DC37E5E"/>
     <w:multiLevelType w:val="multilevel"/>
     <w:tmpl w:val="44943224"/>
@@ -6072,7 +6776,7 @@
       </w:rPr>
     </w:lvl>
   </w:abstractNum>
-  <w:abstractNum w:abstractNumId="9" w15:restartNumberingAfterBreak="0">
+  <w:abstractNum w:abstractNumId="11" w15:restartNumberingAfterBreak="0">
     <w:nsid w:val="4EF01481"/>
     <w:multiLevelType w:val="multilevel"/>
     <w:tmpl w:val="A11E9930"/>
@@ -6221,7 +6925,7 @@
       </w:rPr>
     </w:lvl>
   </w:abstractNum>
-  <w:abstractNum w:abstractNumId="10" w15:restartNumberingAfterBreak="0">
+  <w:abstractNum w:abstractNumId="12" w15:restartNumberingAfterBreak="0">
     <w:nsid w:val="55457C22"/>
     <w:multiLevelType w:val="multilevel"/>
     <w:tmpl w:val="F7866B26"/>
@@ -6370,7 +7074,305 @@
       </w:rPr>
     </w:lvl>
   </w:abstractNum>
-  <w:abstractNum w:abstractNumId="11" w15:restartNumberingAfterBreak="0">
+  <w:abstractNum w:abstractNumId="13" w15:restartNumberingAfterBreak="0">
+    <w:nsid w:val="561F1E6A"/>
+    <w:multiLevelType w:val="multilevel"/>
+    <w:tmpl w:val="F9861FA0"/>
+    <w:lvl w:ilvl="0">
+      <w:start w:val="1"/>
+      <w:numFmt w:val="bullet"/>
+      <w:lvlText w:val=""/>
+      <w:lvlJc w:val="left"/>
+      <w:pPr>
+        <w:tabs>
+          <w:tab w:val="num" w:pos="720"/>
+        </w:tabs>
+        <w:ind w:left="720" w:hanging="360"/>
+      </w:pPr>
+      <w:rPr>
+        <w:rFonts w:ascii="Symbol" w:hAnsi="Symbol" w:hint="default"/>
+        <w:sz w:val="20"/>
+      </w:rPr>
+    </w:lvl>
+    <w:lvl w:ilvl="1" w:tentative="1">
+      <w:start w:val="1"/>
+      <w:numFmt w:val="bullet"/>
+      <w:lvlText w:val="o"/>
+      <w:lvlJc w:val="left"/>
+      <w:pPr>
+        <w:tabs>
+          <w:tab w:val="num" w:pos="1440"/>
+        </w:tabs>
+        <w:ind w:left="1440" w:hanging="360"/>
+      </w:pPr>
+      <w:rPr>
+        <w:rFonts w:ascii="Courier New" w:hAnsi="Courier New" w:hint="default"/>
+        <w:sz w:val="20"/>
+      </w:rPr>
+    </w:lvl>
+    <w:lvl w:ilvl="2" w:tentative="1">
+      <w:start w:val="1"/>
+      <w:numFmt w:val="bullet"/>
+      <w:lvlText w:val=""/>
+      <w:lvlJc w:val="left"/>
+      <w:pPr>
+        <w:tabs>
+          <w:tab w:val="num" w:pos="2160"/>
+        </w:tabs>
+        <w:ind w:left="2160" w:hanging="360"/>
+      </w:pPr>
+      <w:rPr>
+        <w:rFonts w:ascii="Wingdings" w:hAnsi="Wingdings" w:hint="default"/>
+        <w:sz w:val="20"/>
+      </w:rPr>
+    </w:lvl>
+    <w:lvl w:ilvl="3" w:tentative="1">
+      <w:start w:val="1"/>
+      <w:numFmt w:val="bullet"/>
+      <w:lvlText w:val=""/>
+      <w:lvlJc w:val="left"/>
+      <w:pPr>
+        <w:tabs>
+          <w:tab w:val="num" w:pos="2880"/>
+        </w:tabs>
+        <w:ind w:left="2880" w:hanging="360"/>
+      </w:pPr>
+      <w:rPr>
+        <w:rFonts w:ascii="Wingdings" w:hAnsi="Wingdings" w:hint="default"/>
+        <w:sz w:val="20"/>
+      </w:rPr>
+    </w:lvl>
+    <w:lvl w:ilvl="4" w:tentative="1">
+      <w:start w:val="1"/>
+      <w:numFmt w:val="bullet"/>
+      <w:lvlText w:val=""/>
+      <w:lvlJc w:val="left"/>
+      <w:pPr>
+        <w:tabs>
+          <w:tab w:val="num" w:pos="3600"/>
+        </w:tabs>
+        <w:ind w:left="3600" w:hanging="360"/>
+      </w:pPr>
+      <w:rPr>
+        <w:rFonts w:ascii="Wingdings" w:hAnsi="Wingdings" w:hint="default"/>
+        <w:sz w:val="20"/>
+      </w:rPr>
+    </w:lvl>
+    <w:lvl w:ilvl="5" w:tentative="1">
+      <w:start w:val="1"/>
+      <w:numFmt w:val="bullet"/>
+      <w:lvlText w:val=""/>
+      <w:lvlJc w:val="left"/>
+      <w:pPr>
+        <w:tabs>
+          <w:tab w:val="num" w:pos="4320"/>
+        </w:tabs>
+        <w:ind w:left="4320" w:hanging="360"/>
+      </w:pPr>
+      <w:rPr>
+        <w:rFonts w:ascii="Wingdings" w:hAnsi="Wingdings" w:hint="default"/>
+        <w:sz w:val="20"/>
+      </w:rPr>
+    </w:lvl>
+    <w:lvl w:ilvl="6" w:tentative="1">
+      <w:start w:val="1"/>
+      <w:numFmt w:val="bullet"/>
+      <w:lvlText w:val=""/>
+      <w:lvlJc w:val="left"/>
+      <w:pPr>
+        <w:tabs>
+          <w:tab w:val="num" w:pos="5040"/>
+        </w:tabs>
+        <w:ind w:left="5040" w:hanging="360"/>
+      </w:pPr>
+      <w:rPr>
+        <w:rFonts w:ascii="Wingdings" w:hAnsi="Wingdings" w:hint="default"/>
+        <w:sz w:val="20"/>
+      </w:rPr>
+    </w:lvl>
+    <w:lvl w:ilvl="7" w:tentative="1">
+      <w:start w:val="1"/>
+      <w:numFmt w:val="bullet"/>
+      <w:lvlText w:val=""/>
+      <w:lvlJc w:val="left"/>
+      <w:pPr>
+        <w:tabs>
+          <w:tab w:val="num" w:pos="5760"/>
+        </w:tabs>
+        <w:ind w:left="5760" w:hanging="360"/>
+      </w:pPr>
+      <w:rPr>
+        <w:rFonts w:ascii="Wingdings" w:hAnsi="Wingdings" w:hint="default"/>
+        <w:sz w:val="20"/>
+      </w:rPr>
+    </w:lvl>
+    <w:lvl w:ilvl="8" w:tentative="1">
+      <w:start w:val="1"/>
+      <w:numFmt w:val="bullet"/>
+      <w:lvlText w:val=""/>
+      <w:lvlJc w:val="left"/>
+      <w:pPr>
+        <w:tabs>
+          <w:tab w:val="num" w:pos="6480"/>
+        </w:tabs>
+        <w:ind w:left="6480" w:hanging="360"/>
+      </w:pPr>
+      <w:rPr>
+        <w:rFonts w:ascii="Wingdings" w:hAnsi="Wingdings" w:hint="default"/>
+        <w:sz w:val="20"/>
+      </w:rPr>
+    </w:lvl>
+  </w:abstractNum>
+  <w:abstractNum w:abstractNumId="14" w15:restartNumberingAfterBreak="0">
+    <w:nsid w:val="571927A1"/>
+    <w:multiLevelType w:val="multilevel"/>
+    <w:tmpl w:val="000E5114"/>
+    <w:lvl w:ilvl="0">
+      <w:start w:val="1"/>
+      <w:numFmt w:val="bullet"/>
+      <w:lvlText w:val=""/>
+      <w:lvlJc w:val="left"/>
+      <w:pPr>
+        <w:tabs>
+          <w:tab w:val="num" w:pos="720"/>
+        </w:tabs>
+        <w:ind w:left="720" w:hanging="360"/>
+      </w:pPr>
+      <w:rPr>
+        <w:rFonts w:ascii="Symbol" w:hAnsi="Symbol" w:hint="default"/>
+        <w:sz w:val="20"/>
+      </w:rPr>
+    </w:lvl>
+    <w:lvl w:ilvl="1" w:tentative="1">
+      <w:start w:val="1"/>
+      <w:numFmt w:val="bullet"/>
+      <w:lvlText w:val="o"/>
+      <w:lvlJc w:val="left"/>
+      <w:pPr>
+        <w:tabs>
+          <w:tab w:val="num" w:pos="1440"/>
+        </w:tabs>
+        <w:ind w:left="1440" w:hanging="360"/>
+      </w:pPr>
+      <w:rPr>
+        <w:rFonts w:ascii="Courier New" w:hAnsi="Courier New" w:hint="default"/>
+        <w:sz w:val="20"/>
+      </w:rPr>
+    </w:lvl>
+    <w:lvl w:ilvl="2" w:tentative="1">
+      <w:start w:val="1"/>
+      <w:numFmt w:val="bullet"/>
+      <w:lvlText w:val=""/>
+      <w:lvlJc w:val="left"/>
+      <w:pPr>
+        <w:tabs>
+          <w:tab w:val="num" w:pos="2160"/>
+        </w:tabs>
+        <w:ind w:left="2160" w:hanging="360"/>
+      </w:pPr>
+      <w:rPr>
+        <w:rFonts w:ascii="Wingdings" w:hAnsi="Wingdings" w:hint="default"/>
+        <w:sz w:val="20"/>
+      </w:rPr>
+    </w:lvl>
+    <w:lvl w:ilvl="3" w:tentative="1">
+      <w:start w:val="1"/>
+      <w:numFmt w:val="bullet"/>
+      <w:lvlText w:val=""/>
+      <w:lvlJc w:val="left"/>
+      <w:pPr>
+        <w:tabs>
+          <w:tab w:val="num" w:pos="2880"/>
+        </w:tabs>
+        <w:ind w:left="2880" w:hanging="360"/>
+      </w:pPr>
+      <w:rPr>
+        <w:rFonts w:ascii="Wingdings" w:hAnsi="Wingdings" w:hint="default"/>
+        <w:sz w:val="20"/>
+      </w:rPr>
+    </w:lvl>
+    <w:lvl w:ilvl="4" w:tentative="1">
+      <w:start w:val="1"/>
+      <w:numFmt w:val="bullet"/>
+      <w:lvlText w:val=""/>
+      <w:lvlJc w:val="left"/>
+      <w:pPr>
+        <w:tabs>
+          <w:tab w:val="num" w:pos="3600"/>
+        </w:tabs>
+        <w:ind w:left="3600" w:hanging="360"/>
+      </w:pPr>
+      <w:rPr>
+        <w:rFonts w:ascii="Wingdings" w:hAnsi="Wingdings" w:hint="default"/>
+        <w:sz w:val="20"/>
+      </w:rPr>
+    </w:lvl>
+    <w:lvl w:ilvl="5" w:tentative="1">
+      <w:start w:val="1"/>
+      <w:numFmt w:val="bullet"/>
+      <w:lvlText w:val=""/>
+      <w:lvlJc w:val="left"/>
+      <w:pPr>
+        <w:tabs>
+          <w:tab w:val="num" w:pos="4320"/>
+        </w:tabs>
+        <w:ind w:left="4320" w:hanging="360"/>
+      </w:pPr>
+      <w:rPr>
+        <w:rFonts w:ascii="Wingdings" w:hAnsi="Wingdings" w:hint="default"/>
+        <w:sz w:val="20"/>
+      </w:rPr>
+    </w:lvl>
+    <w:lvl w:ilvl="6" w:tentative="1">
+      <w:start w:val="1"/>
+      <w:numFmt w:val="bullet"/>
+      <w:lvlText w:val=""/>
+      <w:lvlJc w:val="left"/>
+      <w:pPr>
+        <w:tabs>
+          <w:tab w:val="num" w:pos="5040"/>
+        </w:tabs>
+        <w:ind w:left="5040" w:hanging="360"/>
+      </w:pPr>
+      <w:rPr>
+        <w:rFonts w:ascii="Wingdings" w:hAnsi="Wingdings" w:hint="default"/>
+        <w:sz w:val="20"/>
+      </w:rPr>
+    </w:lvl>
+    <w:lvl w:ilvl="7" w:tentative="1">
+      <w:start w:val="1"/>
+      <w:numFmt w:val="bullet"/>
+      <w:lvlText w:val=""/>
+      <w:lvlJc w:val="left"/>
+      <w:pPr>
+        <w:tabs>
+          <w:tab w:val="num" w:pos="5760"/>
+        </w:tabs>
+        <w:ind w:left="5760" w:hanging="360"/>
+      </w:pPr>
+      <w:rPr>
+        <w:rFonts w:ascii="Wingdings" w:hAnsi="Wingdings" w:hint="default"/>
+        <w:sz w:val="20"/>
+      </w:rPr>
+    </w:lvl>
+    <w:lvl w:ilvl="8" w:tentative="1">
+      <w:start w:val="1"/>
+      <w:numFmt w:val="bullet"/>
+      <w:lvlText w:val=""/>
+      <w:lvlJc w:val="left"/>
+      <w:pPr>
+        <w:tabs>
+          <w:tab w:val="num" w:pos="6480"/>
+        </w:tabs>
+        <w:ind w:left="6480" w:hanging="360"/>
+      </w:pPr>
+      <w:rPr>
+        <w:rFonts w:ascii="Wingdings" w:hAnsi="Wingdings" w:hint="default"/>
+        <w:sz w:val="20"/>
+      </w:rPr>
+    </w:lvl>
+  </w:abstractNum>
+  <w:abstractNum w:abstractNumId="15" w15:restartNumberingAfterBreak="0">
     <w:nsid w:val="5F7B48E4"/>
     <w:multiLevelType w:val="multilevel"/>
     <w:tmpl w:val="1F5670A6"/>
@@ -6483,7 +7485,7 @@
       </w:pPr>
     </w:lvl>
   </w:abstractNum>
-  <w:abstractNum w:abstractNumId="12" w15:restartNumberingAfterBreak="0">
+  <w:abstractNum w:abstractNumId="16" w15:restartNumberingAfterBreak="0">
     <w:nsid w:val="5FF75A6D"/>
     <w:multiLevelType w:val="multilevel"/>
     <w:tmpl w:val="A0F66E5C"/>
@@ -6632,7 +7634,7 @@
       </w:rPr>
     </w:lvl>
   </w:abstractNum>
-  <w:abstractNum w:abstractNumId="13" w15:restartNumberingAfterBreak="0">
+  <w:abstractNum w:abstractNumId="17" w15:restartNumberingAfterBreak="0">
     <w:nsid w:val="65DE44F2"/>
     <w:multiLevelType w:val="multilevel"/>
     <w:tmpl w:val="8D40347A"/>
@@ -6745,7 +7747,7 @@
       </w:pPr>
     </w:lvl>
   </w:abstractNum>
-  <w:abstractNum w:abstractNumId="14" w15:restartNumberingAfterBreak="0">
+  <w:abstractNum w:abstractNumId="18" w15:restartNumberingAfterBreak="0">
     <w:nsid w:val="73473A48"/>
     <w:multiLevelType w:val="multilevel"/>
     <w:tmpl w:val="5AF4D1C0"/>
@@ -6894,7 +7896,7 @@
       </w:rPr>
     </w:lvl>
   </w:abstractNum>
-  <w:abstractNum w:abstractNumId="15" w15:restartNumberingAfterBreak="0">
+  <w:abstractNum w:abstractNumId="19" w15:restartNumberingAfterBreak="0">
     <w:nsid w:val="7546600C"/>
     <w:multiLevelType w:val="multilevel"/>
     <w:tmpl w:val="D73828DA"/>
@@ -7043,7 +8045,7 @@
       </w:rPr>
     </w:lvl>
   </w:abstractNum>
-  <w:abstractNum w:abstractNumId="16" w15:restartNumberingAfterBreak="0">
+  <w:abstractNum w:abstractNumId="20" w15:restartNumberingAfterBreak="0">
     <w:nsid w:val="7A7111BF"/>
     <w:multiLevelType w:val="multilevel"/>
     <w:tmpl w:val="EA322BA6"/>
@@ -7193,55 +8195,67 @@
     </w:lvl>
   </w:abstractNum>
   <w:num w:numId="1" w16cid:durableId="1222013107">
+    <w:abstractNumId w:val="4"/>
+  </w:num>
+  <w:num w:numId="2" w16cid:durableId="738668883">
+    <w:abstractNumId w:val="11"/>
+  </w:num>
+  <w:num w:numId="3" w16cid:durableId="5791519">
+    <w:abstractNumId w:val="12"/>
+  </w:num>
+  <w:num w:numId="4" w16cid:durableId="674724245">
+    <w:abstractNumId w:val="16"/>
+  </w:num>
+  <w:num w:numId="5" w16cid:durableId="582569914">
     <w:abstractNumId w:val="3"/>
   </w:num>
-  <w:num w:numId="2" w16cid:durableId="738668883">
+  <w:num w:numId="6" w16cid:durableId="1345400040">
+    <w:abstractNumId w:val="19"/>
+  </w:num>
+  <w:num w:numId="7" w16cid:durableId="890074338">
+    <w:abstractNumId w:val="1"/>
+  </w:num>
+  <w:num w:numId="8" w16cid:durableId="431704830">
+    <w:abstractNumId w:val="15"/>
+  </w:num>
+  <w:num w:numId="9" w16cid:durableId="1348828581">
+    <w:abstractNumId w:val="7"/>
+  </w:num>
+  <w:num w:numId="10" w16cid:durableId="1938294600">
+    <w:abstractNumId w:val="8"/>
+  </w:num>
+  <w:num w:numId="11" w16cid:durableId="1950699514">
+    <w:abstractNumId w:val="20"/>
+  </w:num>
+  <w:num w:numId="12" w16cid:durableId="518591842">
+    <w:abstractNumId w:val="5"/>
+  </w:num>
+  <w:num w:numId="13" w16cid:durableId="1219171571">
+    <w:abstractNumId w:val="2"/>
+  </w:num>
+  <w:num w:numId="14" w16cid:durableId="840386719">
+    <w:abstractNumId w:val="18"/>
+  </w:num>
+  <w:num w:numId="15" w16cid:durableId="1090853232">
+    <w:abstractNumId w:val="17"/>
+  </w:num>
+  <w:num w:numId="16" w16cid:durableId="32849798">
+    <w:abstractNumId w:val="10"/>
+  </w:num>
+  <w:num w:numId="17" w16cid:durableId="1398898140">
+    <w:abstractNumId w:val="6"/>
+  </w:num>
+  <w:num w:numId="18" w16cid:durableId="520512773">
+    <w:abstractNumId w:val="0"/>
+  </w:num>
+  <w:num w:numId="19" w16cid:durableId="1353873044">
     <w:abstractNumId w:val="9"/>
   </w:num>
-  <w:num w:numId="3" w16cid:durableId="5791519">
-    <w:abstractNumId w:val="10"/>
-  </w:num>
-  <w:num w:numId="4" w16cid:durableId="674724245">
-    <w:abstractNumId w:val="12"/>
-  </w:num>
-  <w:num w:numId="5" w16cid:durableId="582569914">
-    <w:abstractNumId w:val="2"/>
-  </w:num>
-  <w:num w:numId="6" w16cid:durableId="1345400040">
-    <w:abstractNumId w:val="15"/>
-  </w:num>
-  <w:num w:numId="7" w16cid:durableId="890074338">
-    <w:abstractNumId w:val="0"/>
-  </w:num>
-  <w:num w:numId="8" w16cid:durableId="431704830">
-    <w:abstractNumId w:val="11"/>
-  </w:num>
-  <w:num w:numId="9" w16cid:durableId="1348828581">
-    <w:abstractNumId w:val="6"/>
-  </w:num>
-  <w:num w:numId="10" w16cid:durableId="1938294600">
-    <w:abstractNumId w:val="7"/>
-  </w:num>
-  <w:num w:numId="11" w16cid:durableId="1950699514">
-    <w:abstractNumId w:val="16"/>
-  </w:num>
-  <w:num w:numId="12" w16cid:durableId="518591842">
-    <w:abstractNumId w:val="4"/>
-  </w:num>
-  <w:num w:numId="13" w16cid:durableId="1219171571">
-    <w:abstractNumId w:val="1"/>
-  </w:num>
-  <w:num w:numId="14" w16cid:durableId="840386719">
+  <w:num w:numId="20" w16cid:durableId="1732577872">
     <w:abstractNumId w:val="14"/>
   </w:num>
-  <w:num w:numId="15" w16cid:durableId="1090853232">
+  <w:num w:numId="21" w16cid:durableId="1584337216">
     <w:abstractNumId w:val="13"/>
-  </w:num>
-  <w:num w:numId="16" w16cid:durableId="32849798">
-    <w:abstractNumId w:val="8"/>
-  </w:num>
-  <w:num w:numId="17" w16cid:durableId="1398898140">
-    <w:abstractNumId w:val="5"/>
   </w:num>
 </w:numbering>
 </file>

</xml_diff>

<commit_message>
Complete payment audit logging rescue Finding 11 — Inconsistent Status Transitions, Finding 12 — No Logs of Payment Activity
</commit_message>
<xml_diff>
--- a/docs/Rescue Report.docx
+++ b/docs/Rescue Report.docx
@@ -6139,7 +6139,21 @@
           <w:b/>
           <w:bCs/>
         </w:rPr>
-        <w:t>Flaw 08: Client-Side Total Calculation (Trust Boundary Violation)</w:t>
+        <w:t>F</w:t>
+      </w:r>
+      <w:r>
+        <w:rPr>
+          <w:b/>
+          <w:bCs/>
+        </w:rPr>
+        <w:t>inding</w:t>
+      </w:r>
+      <w:r>
+        <w:rPr>
+          <w:b/>
+          <w:bCs/>
+        </w:rPr>
+        <w:t xml:space="preserve"> 08: Client-Side Total Calculation (Trust Boundary Violation)</w:t>
       </w:r>
     </w:p>
     <w:tbl>
@@ -7054,7 +7068,21 @@
           <w:bCs/>
         </w:rPr>
         <w:lastRenderedPageBreak/>
-        <w:t>Flaw 09: Database Indexing and N+1 Query Risk</w:t>
+        <w:t>F</w:t>
+      </w:r>
+      <w:r>
+        <w:rPr>
+          <w:b/>
+          <w:bCs/>
+        </w:rPr>
+        <w:t>inding</w:t>
+      </w:r>
+      <w:r>
+        <w:rPr>
+          <w:b/>
+          <w:bCs/>
+        </w:rPr>
+        <w:t xml:space="preserve"> 09: Database Indexing and N+1 Query Risk</w:t>
       </w:r>
     </w:p>
     <w:tbl>
@@ -8846,6 +8874,1915 @@
       </w:r>
     </w:p>
     <w:p/>
+    <w:p>
+      <w:pPr>
+        <w:rPr>
+          <w:b/>
+          <w:bCs/>
+        </w:rPr>
+      </w:pPr>
+      <w:r>
+        <w:rPr>
+          <w:b/>
+          <w:bCs/>
+        </w:rPr>
+        <w:t>Finding 11 — Inconsistent Status Transitions</w:t>
+      </w:r>
+    </w:p>
+    <w:p>
+      <w:r>
+        <w:rPr>
+          <w:b/>
+          <w:bCs/>
+        </w:rPr>
+        <w:t>Severity:</w:t>
+      </w:r>
+      <w:r>
+        <w:t xml:space="preserve"> Medium</w:t>
+      </w:r>
+      <w:r>
+        <w:br/>
+      </w:r>
+      <w:r>
+        <w:rPr>
+          <w:b/>
+          <w:bCs/>
+        </w:rPr>
+        <w:t>Category:</w:t>
+      </w:r>
+      <w:r>
+        <w:t xml:space="preserve"> Business Logic / Inconsistent Behavior</w:t>
+      </w:r>
+      <w:r>
+        <w:br/>
+      </w:r>
+      <w:r>
+        <w:rPr>
+          <w:b/>
+          <w:bCs/>
+        </w:rPr>
+        <w:t>Status:</w:t>
+      </w:r>
+      <w:r>
+        <w:t xml:space="preserve"> Status-transition validation and partial-payment handling implemented and verified through runtime testing.</w:t>
+      </w:r>
+    </w:p>
+    <w:p>
+      <w:pPr>
+        <w:rPr>
+          <w:b/>
+          <w:bCs/>
+        </w:rPr>
+      </w:pPr>
+      <w:r>
+        <w:rPr>
+          <w:b/>
+          <w:bCs/>
+        </w:rPr>
+        <w:t>1. Finding</w:t>
+      </w:r>
+    </w:p>
+    <w:p>
+      <w:r>
+        <w:t>The original audit report identified insufficient validation of invoice status transitions. Without appropriate checks, invoices could be marked as paid when voided, sent after payment, or paid without following the intended workflow.</w:t>
+      </w:r>
+    </w:p>
+    <w:p>
+      <w:r>
+        <w:t>The current implementation includes status checks for sending, voiding, and recording payments.</w:t>
+      </w:r>
+    </w:p>
+    <w:p>
+      <w:pPr>
+        <w:rPr>
+          <w:b/>
+          <w:bCs/>
+        </w:rPr>
+      </w:pPr>
+      <w:r>
+        <w:rPr>
+          <w:b/>
+          <w:bCs/>
+        </w:rPr>
+        <w:t>2. Inspection</w:t>
+      </w:r>
+    </w:p>
+    <w:p>
+      <w:r>
+        <w:t xml:space="preserve">Inspected </w:t>
+      </w:r>
+      <w:proofErr w:type="spellStart"/>
+      <w:r>
+        <w:t>src</w:t>
+      </w:r>
+      <w:proofErr w:type="spellEnd"/>
+      <w:r>
+        <w:t>/app/</w:t>
+      </w:r>
+      <w:proofErr w:type="spellStart"/>
+      <w:r>
+        <w:t>api</w:t>
+      </w:r>
+      <w:proofErr w:type="spellEnd"/>
+      <w:r>
+        <w:t>/invoices/[id]/</w:t>
+      </w:r>
+      <w:proofErr w:type="spellStart"/>
+      <w:r>
+        <w:t>route.ts</w:t>
+      </w:r>
+      <w:proofErr w:type="spellEnd"/>
+      <w:r>
+        <w:t xml:space="preserve"> and confirmed the following behavior:</w:t>
+      </w:r>
+    </w:p>
+    <w:p>
+      <w:pPr>
+        <w:numPr>
+          <w:ilvl w:val="0"/>
+          <w:numId w:val="40"/>
+        </w:numPr>
+      </w:pPr>
+      <w:r>
+        <w:t>Only draft invoices can be sent. Attempts to send invoices in other statuses return HTTP 409 Conflict.</w:t>
+      </w:r>
+    </w:p>
+    <w:p>
+      <w:pPr>
+        <w:numPr>
+          <w:ilvl w:val="0"/>
+          <w:numId w:val="40"/>
+        </w:numPr>
+      </w:pPr>
+      <w:r>
+        <w:t>Paid and void invoices cannot receive new payments.</w:t>
+      </w:r>
+    </w:p>
+    <w:p>
+      <w:pPr>
+        <w:numPr>
+          <w:ilvl w:val="0"/>
+          <w:numId w:val="40"/>
+        </w:numPr>
+      </w:pPr>
+      <w:r>
+        <w:t>Paid invoices cannot be voided.</w:t>
+      </w:r>
+    </w:p>
+    <w:p>
+      <w:pPr>
+        <w:numPr>
+          <w:ilvl w:val="0"/>
+          <w:numId w:val="40"/>
+        </w:numPr>
+      </w:pPr>
+      <w:r>
+        <w:t>Payments are recorded separately in the payments table.</w:t>
+      </w:r>
+    </w:p>
+    <w:p>
+      <w:pPr>
+        <w:numPr>
+          <w:ilvl w:val="0"/>
+          <w:numId w:val="40"/>
+        </w:numPr>
+      </w:pPr>
+      <w:r>
+        <w:t xml:space="preserve">The invoice's </w:t>
+      </w:r>
+      <w:proofErr w:type="spellStart"/>
+      <w:r>
+        <w:t>paidAmount</w:t>
+      </w:r>
+      <w:proofErr w:type="spellEnd"/>
+      <w:r>
+        <w:t xml:space="preserve"> is updated when a payment is recorded.</w:t>
+      </w:r>
+    </w:p>
+    <w:p>
+      <w:pPr>
+        <w:numPr>
+          <w:ilvl w:val="0"/>
+          <w:numId w:val="40"/>
+        </w:numPr>
+      </w:pPr>
+      <w:r>
+        <w:t>The invoice status changes to paid when the cumulative paid amount reaches the invoice total.</w:t>
+      </w:r>
+    </w:p>
+    <w:p>
+      <w:pPr>
+        <w:numPr>
+          <w:ilvl w:val="0"/>
+          <w:numId w:val="40"/>
+        </w:numPr>
+      </w:pPr>
+      <w:r>
+        <w:t>Draft and sent invoices can receive payments under the current business logic.</w:t>
+      </w:r>
+    </w:p>
+    <w:p>
+      <w:pPr>
+        <w:rPr>
+          <w:b/>
+          <w:bCs/>
+        </w:rPr>
+      </w:pPr>
+      <w:r>
+        <w:rPr>
+          <w:b/>
+          <w:bCs/>
+        </w:rPr>
+        <w:lastRenderedPageBreak/>
+        <w:t>3. Verification</w:t>
+      </w:r>
+    </w:p>
+    <w:tbl>
+      <w:tblPr>
+        <w:tblW w:w="0" w:type="auto"/>
+        <w:tblCellSpacing w:w="15" w:type="dxa"/>
+        <w:tblCellMar>
+          <w:top w:w="15" w:type="dxa"/>
+          <w:left w:w="15" w:type="dxa"/>
+          <w:bottom w:w="15" w:type="dxa"/>
+          <w:right w:w="15" w:type="dxa"/>
+        </w:tblCellMar>
+        <w:tblLook w:val="04A0" w:firstRow="1" w:lastRow="0" w:firstColumn="1" w:lastColumn="0" w:noHBand="0" w:noVBand="1"/>
+      </w:tblPr>
+      <w:tblGrid>
+        <w:gridCol w:w="2976"/>
+        <w:gridCol w:w="6384"/>
+      </w:tblGrid>
+      <w:tr>
+        <w:trPr>
+          <w:tblCellSpacing w:w="15" w:type="dxa"/>
+        </w:trPr>
+        <w:tc>
+          <w:tcPr>
+            <w:tcW w:w="0" w:type="auto"/>
+            <w:vAlign w:val="center"/>
+            <w:hideMark/>
+          </w:tcPr>
+          <w:p>
+            <w:pPr>
+              <w:rPr>
+                <w:b/>
+                <w:bCs/>
+              </w:rPr>
+            </w:pPr>
+            <w:r>
+              <w:rPr>
+                <w:b/>
+                <w:bCs/>
+              </w:rPr>
+              <w:t>Test</w:t>
+            </w:r>
+          </w:p>
+        </w:tc>
+        <w:tc>
+          <w:tcPr>
+            <w:tcW w:w="0" w:type="auto"/>
+            <w:vAlign w:val="center"/>
+            <w:hideMark/>
+          </w:tcPr>
+          <w:p>
+            <w:pPr>
+              <w:rPr>
+                <w:b/>
+                <w:bCs/>
+              </w:rPr>
+            </w:pPr>
+            <w:r>
+              <w:rPr>
+                <w:b/>
+                <w:bCs/>
+              </w:rPr>
+              <w:t>Result</w:t>
+            </w:r>
+          </w:p>
+        </w:tc>
+      </w:tr>
+      <w:tr>
+        <w:trPr>
+          <w:tblCellSpacing w:w="15" w:type="dxa"/>
+        </w:trPr>
+        <w:tc>
+          <w:tcPr>
+            <w:tcW w:w="0" w:type="auto"/>
+            <w:vAlign w:val="center"/>
+            <w:hideMark/>
+          </w:tcPr>
+          <w:p>
+            <w:r>
+              <w:t>Send a draft invoice</w:t>
+            </w:r>
+          </w:p>
+        </w:tc>
+        <w:tc>
+          <w:tcPr>
+            <w:tcW w:w="0" w:type="auto"/>
+            <w:vAlign w:val="center"/>
+            <w:hideMark/>
+          </w:tcPr>
+          <w:p>
+            <w:r>
+              <w:t xml:space="preserve">Passed — invoice status changed to </w:t>
+            </w:r>
+            <w:proofErr w:type="spellStart"/>
+            <w:r>
+              <w:t>sent</w:t>
+            </w:r>
+            <w:proofErr w:type="spellEnd"/>
+            <w:r>
+              <w:t>.</w:t>
+            </w:r>
+          </w:p>
+        </w:tc>
+      </w:tr>
+      <w:tr>
+        <w:trPr>
+          <w:tblCellSpacing w:w="15" w:type="dxa"/>
+        </w:trPr>
+        <w:tc>
+          <w:tcPr>
+            <w:tcW w:w="0" w:type="auto"/>
+            <w:vAlign w:val="center"/>
+            <w:hideMark/>
+          </w:tcPr>
+          <w:p>
+            <w:r>
+              <w:t>Record a partial payment</w:t>
+            </w:r>
+          </w:p>
+        </w:tc>
+        <w:tc>
+          <w:tcPr>
+            <w:tcW w:w="0" w:type="auto"/>
+            <w:vAlign w:val="center"/>
+            <w:hideMark/>
+          </w:tcPr>
+          <w:p>
+            <w:r>
+              <w:t>Passed — paid amount and remaining balance updated correctly.</w:t>
+            </w:r>
+          </w:p>
+        </w:tc>
+      </w:tr>
+      <w:tr>
+        <w:trPr>
+          <w:tblCellSpacing w:w="15" w:type="dxa"/>
+        </w:trPr>
+        <w:tc>
+          <w:tcPr>
+            <w:tcW w:w="0" w:type="auto"/>
+            <w:vAlign w:val="center"/>
+            <w:hideMark/>
+          </w:tcPr>
+          <w:p>
+            <w:r>
+              <w:t>Record the remaining balance</w:t>
+            </w:r>
+          </w:p>
+        </w:tc>
+        <w:tc>
+          <w:tcPr>
+            <w:tcW w:w="0" w:type="auto"/>
+            <w:vAlign w:val="center"/>
+            <w:hideMark/>
+          </w:tcPr>
+          <w:p>
+            <w:r>
+              <w:t>Passed — invoice status changed to paid.</w:t>
+            </w:r>
+          </w:p>
+        </w:tc>
+      </w:tr>
+      <w:tr>
+        <w:trPr>
+          <w:tblCellSpacing w:w="15" w:type="dxa"/>
+        </w:trPr>
+        <w:tc>
+          <w:tcPr>
+            <w:tcW w:w="0" w:type="auto"/>
+            <w:vAlign w:val="center"/>
+            <w:hideMark/>
+          </w:tcPr>
+          <w:p>
+            <w:r>
+              <w:t>Record multiple payments</w:t>
+            </w:r>
+          </w:p>
+        </w:tc>
+        <w:tc>
+          <w:tcPr>
+            <w:tcW w:w="0" w:type="auto"/>
+            <w:vAlign w:val="center"/>
+            <w:hideMark/>
+          </w:tcPr>
+          <w:p>
+            <w:r>
+              <w:t>Passed — payments appeared separately in the invoice details.</w:t>
+            </w:r>
+          </w:p>
+        </w:tc>
+      </w:tr>
+    </w:tbl>
+    <w:p>
+      <w:r>
+        <w:rPr>
+          <w:b/>
+          <w:bCs/>
+        </w:rPr>
+        <w:t>Runtime payment test evidence:</w:t>
+      </w:r>
+    </w:p>
+    <w:tbl>
+      <w:tblPr>
+        <w:tblW w:w="0" w:type="auto"/>
+        <w:tblCellSpacing w:w="15" w:type="dxa"/>
+        <w:tblCellMar>
+          <w:top w:w="15" w:type="dxa"/>
+          <w:left w:w="15" w:type="dxa"/>
+          <w:bottom w:w="15" w:type="dxa"/>
+          <w:right w:w="15" w:type="dxa"/>
+        </w:tblCellMar>
+        <w:tblLook w:val="04A0" w:firstRow="1" w:lastRow="0" w:firstColumn="1" w:lastColumn="0" w:noHBand="0" w:noVBand="1"/>
+      </w:tblPr>
+      <w:tblGrid>
+        <w:gridCol w:w="3779"/>
+        <w:gridCol w:w="866"/>
+      </w:tblGrid>
+      <w:tr>
+        <w:trPr>
+          <w:tblCellSpacing w:w="15" w:type="dxa"/>
+        </w:trPr>
+        <w:tc>
+          <w:tcPr>
+            <w:tcW w:w="0" w:type="auto"/>
+            <w:vAlign w:val="center"/>
+            <w:hideMark/>
+          </w:tcPr>
+          <w:p>
+            <w:pPr>
+              <w:rPr>
+                <w:b/>
+                <w:bCs/>
+              </w:rPr>
+            </w:pPr>
+            <w:r>
+              <w:rPr>
+                <w:b/>
+                <w:bCs/>
+              </w:rPr>
+              <w:t>Item</w:t>
+            </w:r>
+          </w:p>
+        </w:tc>
+        <w:tc>
+          <w:tcPr>
+            <w:tcW w:w="0" w:type="auto"/>
+            <w:vAlign w:val="center"/>
+            <w:hideMark/>
+          </w:tcPr>
+          <w:p>
+            <w:pPr>
+              <w:rPr>
+                <w:b/>
+                <w:bCs/>
+              </w:rPr>
+            </w:pPr>
+            <w:r>
+              <w:rPr>
+                <w:b/>
+                <w:bCs/>
+              </w:rPr>
+              <w:t>Result</w:t>
+            </w:r>
+          </w:p>
+        </w:tc>
+      </w:tr>
+      <w:tr>
+        <w:trPr>
+          <w:tblCellSpacing w:w="15" w:type="dxa"/>
+        </w:trPr>
+        <w:tc>
+          <w:tcPr>
+            <w:tcW w:w="0" w:type="auto"/>
+            <w:vAlign w:val="center"/>
+            <w:hideMark/>
+          </w:tcPr>
+          <w:p>
+            <w:r>
+              <w:t>Invoice total</w:t>
+            </w:r>
+          </w:p>
+        </w:tc>
+        <w:tc>
+          <w:tcPr>
+            <w:tcW w:w="0" w:type="auto"/>
+            <w:vAlign w:val="center"/>
+            <w:hideMark/>
+          </w:tcPr>
+          <w:p>
+            <w:r>
+              <w:t>$220.00</w:t>
+            </w:r>
+          </w:p>
+        </w:tc>
+      </w:tr>
+      <w:tr>
+        <w:trPr>
+          <w:tblCellSpacing w:w="15" w:type="dxa"/>
+        </w:trPr>
+        <w:tc>
+          <w:tcPr>
+            <w:tcW w:w="0" w:type="auto"/>
+            <w:vAlign w:val="center"/>
+            <w:hideMark/>
+          </w:tcPr>
+          <w:p>
+            <w:r>
+              <w:t>First payment</w:t>
+            </w:r>
+          </w:p>
+        </w:tc>
+        <w:tc>
+          <w:tcPr>
+            <w:tcW w:w="0" w:type="auto"/>
+            <w:vAlign w:val="center"/>
+            <w:hideMark/>
+          </w:tcPr>
+          <w:p>
+            <w:r>
+              <w:t>$200.00</w:t>
+            </w:r>
+          </w:p>
+        </w:tc>
+      </w:tr>
+      <w:tr>
+        <w:trPr>
+          <w:tblCellSpacing w:w="15" w:type="dxa"/>
+        </w:trPr>
+        <w:tc>
+          <w:tcPr>
+            <w:tcW w:w="0" w:type="auto"/>
+            <w:vAlign w:val="center"/>
+            <w:hideMark/>
+          </w:tcPr>
+          <w:p>
+            <w:r>
+              <w:t>Remaining balance after first payment</w:t>
+            </w:r>
+          </w:p>
+        </w:tc>
+        <w:tc>
+          <w:tcPr>
+            <w:tcW w:w="0" w:type="auto"/>
+            <w:vAlign w:val="center"/>
+            <w:hideMark/>
+          </w:tcPr>
+          <w:p>
+            <w:r>
+              <w:t>$20.00</w:t>
+            </w:r>
+          </w:p>
+        </w:tc>
+      </w:tr>
+      <w:tr>
+        <w:trPr>
+          <w:tblCellSpacing w:w="15" w:type="dxa"/>
+        </w:trPr>
+        <w:tc>
+          <w:tcPr>
+            <w:tcW w:w="0" w:type="auto"/>
+            <w:vAlign w:val="center"/>
+            <w:hideMark/>
+          </w:tcPr>
+          <w:p>
+            <w:r>
+              <w:t>Second payment</w:t>
+            </w:r>
+          </w:p>
+        </w:tc>
+        <w:tc>
+          <w:tcPr>
+            <w:tcW w:w="0" w:type="auto"/>
+            <w:vAlign w:val="center"/>
+            <w:hideMark/>
+          </w:tcPr>
+          <w:p>
+            <w:r>
+              <w:t>$20.00</w:t>
+            </w:r>
+          </w:p>
+        </w:tc>
+      </w:tr>
+      <w:tr>
+        <w:trPr>
+          <w:tblCellSpacing w:w="15" w:type="dxa"/>
+        </w:trPr>
+        <w:tc>
+          <w:tcPr>
+            <w:tcW w:w="0" w:type="auto"/>
+            <w:vAlign w:val="center"/>
+            <w:hideMark/>
+          </w:tcPr>
+          <w:p>
+            <w:r>
+              <w:t>Final paid amount</w:t>
+            </w:r>
+          </w:p>
+        </w:tc>
+        <w:tc>
+          <w:tcPr>
+            <w:tcW w:w="0" w:type="auto"/>
+            <w:vAlign w:val="center"/>
+            <w:hideMark/>
+          </w:tcPr>
+          <w:p>
+            <w:r>
+              <w:t>$220.00</w:t>
+            </w:r>
+          </w:p>
+        </w:tc>
+      </w:tr>
+      <w:tr>
+        <w:trPr>
+          <w:tblCellSpacing w:w="15" w:type="dxa"/>
+        </w:trPr>
+        <w:tc>
+          <w:tcPr>
+            <w:tcW w:w="0" w:type="auto"/>
+            <w:vAlign w:val="center"/>
+            <w:hideMark/>
+          </w:tcPr>
+          <w:p>
+            <w:r>
+              <w:t>Final remaining balance</w:t>
+            </w:r>
+          </w:p>
+        </w:tc>
+        <w:tc>
+          <w:tcPr>
+            <w:tcW w:w="0" w:type="auto"/>
+            <w:vAlign w:val="center"/>
+            <w:hideMark/>
+          </w:tcPr>
+          <w:p>
+            <w:r>
+              <w:t>$0.00</w:t>
+            </w:r>
+          </w:p>
+        </w:tc>
+      </w:tr>
+      <w:tr>
+        <w:trPr>
+          <w:tblCellSpacing w:w="15" w:type="dxa"/>
+        </w:trPr>
+        <w:tc>
+          <w:tcPr>
+            <w:tcW w:w="0" w:type="auto"/>
+            <w:vAlign w:val="center"/>
+            <w:hideMark/>
+          </w:tcPr>
+          <w:p>
+            <w:r>
+              <w:t>Final invoice status</w:t>
+            </w:r>
+          </w:p>
+        </w:tc>
+        <w:tc>
+          <w:tcPr>
+            <w:tcW w:w="0" w:type="auto"/>
+            <w:vAlign w:val="center"/>
+            <w:hideMark/>
+          </w:tcPr>
+          <w:p>
+            <w:r>
+              <w:t>paid</w:t>
+            </w:r>
+          </w:p>
+        </w:tc>
+      </w:tr>
+    </w:tbl>
+    <w:p>
+      <w:r>
+        <w:t>The invoice details displayed both payment records, including their amounts, transaction references, payment methods, and timestamps.</w:t>
+      </w:r>
+    </w:p>
+    <w:p>
+      <w:pPr>
+        <w:rPr>
+          <w:b/>
+          <w:bCs/>
+        </w:rPr>
+      </w:pPr>
+      <w:r>
+        <w:rPr>
+          <w:b/>
+          <w:bCs/>
+        </w:rPr>
+        <w:t>4. Work Performed</w:t>
+      </w:r>
+    </w:p>
+    <w:p>
+      <w:r>
+        <w:t>Reviewed the existing invoice API implementation and verified its status-transition checks and partial-payment behavior through runtime testing.</w:t>
+      </w:r>
+    </w:p>
+    <w:p>
+      <w:r>
+        <w:t>No additional application-code changes were made for this finding during the verification described above.</w:t>
+      </w:r>
+    </w:p>
+    <w:p>
+      <w:pPr>
+        <w:rPr>
+          <w:b/>
+          <w:bCs/>
+        </w:rPr>
+      </w:pPr>
+      <w:r>
+        <w:rPr>
+          <w:b/>
+          <w:bCs/>
+        </w:rPr>
+        <w:t>5. Conclusion and Limitations</w:t>
+      </w:r>
+    </w:p>
+    <w:p>
+      <w:r>
+        <w:lastRenderedPageBreak/>
+        <w:t>The implemented status checks and partial-payment workflow passed the runtime tests performed. The application correctly updated the paid amount, remaining balance, payment records, and final invoice status during the tested payment sequence.</w:t>
+      </w:r>
+    </w:p>
+    <w:p>
+      <w:r>
+        <w:t>The current business logic permits payments against draft invoices. This behavior has been retained as an accepted application rule rather than treated as a defect.</w:t>
+      </w:r>
+    </w:p>
+    <w:p>
+      <w:r>
+        <w:rPr>
+          <w:b/>
+          <w:bCs/>
+        </w:rPr>
+        <w:t>Next action:</w:t>
+      </w:r>
+      <w:r>
+        <w:t xml:space="preserve"> Continue the ordered audit with Finding 12 — No Logs of Payment Activity (Audit Trail Gap).</w:t>
+      </w:r>
+    </w:p>
+    <w:p>
+      <w:r>
+        <w:pict w14:anchorId="7F5F3E78">
+          <v:rect id="_x0000_i1025" style="width:0;height:1.5pt" o:hralign="center" o:hrstd="t" o:hr="t" fillcolor="#a0a0a0" stroked="f"/>
+        </w:pict>
+      </w:r>
+    </w:p>
+    <w:p>
+      <w:pPr>
+        <w:rPr>
+          <w:b/>
+          <w:bCs/>
+        </w:rPr>
+      </w:pPr>
+      <w:r>
+        <w:rPr>
+          <w:b/>
+          <w:bCs/>
+        </w:rPr>
+        <w:t>Audit Summary</w:t>
+      </w:r>
+    </w:p>
+    <w:tbl>
+      <w:tblPr>
+        <w:tblW w:w="0" w:type="auto"/>
+        <w:tblCellSpacing w:w="15" w:type="dxa"/>
+        <w:tblCellMar>
+          <w:top w:w="15" w:type="dxa"/>
+          <w:left w:w="15" w:type="dxa"/>
+          <w:bottom w:w="15" w:type="dxa"/>
+          <w:right w:w="15" w:type="dxa"/>
+        </w:tblCellMar>
+        <w:tblLook w:val="04A0" w:firstRow="1" w:lastRow="0" w:firstColumn="1" w:lastColumn="0" w:noHBand="0" w:noVBand="1"/>
+      </w:tblPr>
+      <w:tblGrid>
+        <w:gridCol w:w="2166"/>
+        <w:gridCol w:w="7194"/>
+      </w:tblGrid>
+      <w:tr>
+        <w:trPr>
+          <w:tblCellSpacing w:w="15" w:type="dxa"/>
+        </w:trPr>
+        <w:tc>
+          <w:tcPr>
+            <w:tcW w:w="0" w:type="auto"/>
+            <w:vAlign w:val="center"/>
+            <w:hideMark/>
+          </w:tcPr>
+          <w:p>
+            <w:pPr>
+              <w:rPr>
+                <w:b/>
+                <w:bCs/>
+              </w:rPr>
+            </w:pPr>
+            <w:r>
+              <w:rPr>
+                <w:b/>
+                <w:bCs/>
+              </w:rPr>
+              <w:t>Audit item</w:t>
+            </w:r>
+          </w:p>
+        </w:tc>
+        <w:tc>
+          <w:tcPr>
+            <w:tcW w:w="0" w:type="auto"/>
+            <w:vAlign w:val="center"/>
+            <w:hideMark/>
+          </w:tcPr>
+          <w:p>
+            <w:pPr>
+              <w:rPr>
+                <w:b/>
+                <w:bCs/>
+              </w:rPr>
+            </w:pPr>
+            <w:r>
+              <w:rPr>
+                <w:b/>
+                <w:bCs/>
+              </w:rPr>
+              <w:t>Evidence-based conclusion</w:t>
+            </w:r>
+          </w:p>
+        </w:tc>
+      </w:tr>
+      <w:tr>
+        <w:trPr>
+          <w:tblCellSpacing w:w="15" w:type="dxa"/>
+        </w:trPr>
+        <w:tc>
+          <w:tcPr>
+            <w:tcW w:w="0" w:type="auto"/>
+            <w:vAlign w:val="center"/>
+            <w:hideMark/>
+          </w:tcPr>
+          <w:p>
+            <w:r>
+              <w:t>Current implementation</w:t>
+            </w:r>
+          </w:p>
+        </w:tc>
+        <w:tc>
+          <w:tcPr>
+            <w:tcW w:w="0" w:type="auto"/>
+            <w:vAlign w:val="center"/>
+            <w:hideMark/>
+          </w:tcPr>
+          <w:p>
+            <w:r>
+              <w:t>Validates invoice-sending, voiding, and payment actions.</w:t>
+            </w:r>
+          </w:p>
+        </w:tc>
+      </w:tr>
+      <w:tr>
+        <w:trPr>
+          <w:tblCellSpacing w:w="15" w:type="dxa"/>
+        </w:trPr>
+        <w:tc>
+          <w:tcPr>
+            <w:tcW w:w="0" w:type="auto"/>
+            <w:vAlign w:val="center"/>
+            <w:hideMark/>
+          </w:tcPr>
+          <w:p>
+            <w:r>
+              <w:t>Verification</w:t>
+            </w:r>
+          </w:p>
+        </w:tc>
+        <w:tc>
+          <w:tcPr>
+            <w:tcW w:w="0" w:type="auto"/>
+            <w:vAlign w:val="center"/>
+            <w:hideMark/>
+          </w:tcPr>
+          <w:p>
+            <w:r>
+              <w:t>Draft-to-sent and partial-to-full payment behavior passed runtime testing.</w:t>
+            </w:r>
+          </w:p>
+        </w:tc>
+      </w:tr>
+      <w:tr>
+        <w:trPr>
+          <w:tblCellSpacing w:w="15" w:type="dxa"/>
+        </w:trPr>
+        <w:tc>
+          <w:tcPr>
+            <w:tcW w:w="0" w:type="auto"/>
+            <w:vAlign w:val="center"/>
+            <w:hideMark/>
+          </w:tcPr>
+          <w:p>
+            <w:r>
+              <w:t>Remediation status</w:t>
+            </w:r>
+          </w:p>
+        </w:tc>
+        <w:tc>
+          <w:tcPr>
+            <w:tcW w:w="0" w:type="auto"/>
+            <w:vAlign w:val="center"/>
+            <w:hideMark/>
+          </w:tcPr>
+          <w:p>
+            <w:r>
+              <w:t>Existing status-transition validation and payment handling verified; no new application-code fix claimed.</w:t>
+            </w:r>
+          </w:p>
+        </w:tc>
+      </w:tr>
+      <w:tr>
+        <w:trPr>
+          <w:tblCellSpacing w:w="15" w:type="dxa"/>
+        </w:trPr>
+        <w:tc>
+          <w:tcPr>
+            <w:tcW w:w="0" w:type="auto"/>
+            <w:vAlign w:val="center"/>
+            <w:hideMark/>
+          </w:tcPr>
+          <w:p>
+            <w:r>
+              <w:t>Additional work</w:t>
+            </w:r>
+          </w:p>
+        </w:tc>
+        <w:tc>
+          <w:tcPr>
+            <w:tcW w:w="0" w:type="auto"/>
+            <w:vAlign w:val="center"/>
+            <w:hideMark/>
+          </w:tcPr>
+          <w:p>
+            <w:r>
+              <w:t>Inspected the invoice API and tested partial and remaining-balance payments.</w:t>
+            </w:r>
+          </w:p>
+        </w:tc>
+      </w:tr>
+      <w:tr>
+        <w:trPr>
+          <w:tblCellSpacing w:w="15" w:type="dxa"/>
+        </w:trPr>
+        <w:tc>
+          <w:tcPr>
+            <w:tcW w:w="0" w:type="auto"/>
+            <w:vAlign w:val="center"/>
+            <w:hideMark/>
+          </w:tcPr>
+          <w:p>
+            <w:r>
+              <w:t>Remaining check</w:t>
+            </w:r>
+          </w:p>
+        </w:tc>
+        <w:tc>
+          <w:tcPr>
+            <w:tcW w:w="0" w:type="auto"/>
+            <w:vAlign w:val="center"/>
+            <w:hideMark/>
+          </w:tcPr>
+          <w:p>
+            <w:r>
+              <w:t>Continue with Finding 12 to inspect payment activity logging and audit-trail coverage.</w:t>
+            </w:r>
+          </w:p>
+        </w:tc>
+      </w:tr>
+    </w:tbl>
+    <w:p>
+      <w:pPr>
+        <w:rPr>
+          <w:b/>
+          <w:bCs/>
+        </w:rPr>
+      </w:pPr>
+      <w:r>
+        <w:rPr>
+          <w:b/>
+          <w:bCs/>
+        </w:rPr>
+        <w:br/>
+      </w:r>
+    </w:p>
+    <w:p>
+      <w:pPr>
+        <w:rPr>
+          <w:b/>
+          <w:bCs/>
+        </w:rPr>
+      </w:pPr>
+      <w:r>
+        <w:rPr>
+          <w:b/>
+          <w:bCs/>
+        </w:rPr>
+        <w:t>Finding 12 — No Logs of Payment Activity (Audit Trail Gap)</w:t>
+      </w:r>
+    </w:p>
+    <w:p>
+      <w:r>
+        <w:rPr>
+          <w:b/>
+          <w:bCs/>
+        </w:rPr>
+        <w:t>Severity:</w:t>
+      </w:r>
+      <w:r>
+        <w:t xml:space="preserve"> Medium</w:t>
+      </w:r>
+      <w:r>
+        <w:br/>
+      </w:r>
+      <w:r>
+        <w:rPr>
+          <w:b/>
+          <w:bCs/>
+        </w:rPr>
+        <w:t>Category:</w:t>
+      </w:r>
+      <w:r>
+        <w:t xml:space="preserve"> Database Structure / Compliance</w:t>
+      </w:r>
+      <w:r>
+        <w:br/>
+      </w:r>
+      <w:r>
+        <w:rPr>
+          <w:b/>
+          <w:bCs/>
+        </w:rPr>
+        <w:t>Status:</w:t>
+      </w:r>
+      <w:r>
+        <w:t xml:space="preserve"> Remediated — Runtime Payment Audit Logging Implemented; Partial Payment Verified</w:t>
+      </w:r>
+    </w:p>
+    <w:p>
+      <w:pPr>
+        <w:rPr>
+          <w:b/>
+          <w:bCs/>
+        </w:rPr>
+      </w:pPr>
+      <w:r>
+        <w:rPr>
+          <w:b/>
+          <w:bCs/>
+        </w:rPr>
+        <w:t>1. Finding</w:t>
+      </w:r>
+    </w:p>
+    <w:p>
+      <w:r>
+        <w:t xml:space="preserve">The application had an </w:t>
+      </w:r>
+      <w:proofErr w:type="spellStart"/>
+      <w:r>
+        <w:t>audit_logs</w:t>
+      </w:r>
+      <w:proofErr w:type="spellEnd"/>
+      <w:r>
+        <w:t xml:space="preserve"> database table, but actual payment activity was not being recorded in it.</w:t>
+      </w:r>
+    </w:p>
+    <w:p>
+      <w:r>
+        <w:lastRenderedPageBreak/>
+        <w:t>The table contained fields for the owner, action, entity, entity ID, metadata, and creation timestamp. However, the invoice payment API did not insert audit records when payments were made.</w:t>
+      </w:r>
+    </w:p>
+    <w:p>
+      <w:r>
+        <w:t>As a result, the application could not maintain a reliable runtime history of payment activity.</w:t>
+      </w:r>
+    </w:p>
+    <w:p>
+      <w:pPr>
+        <w:rPr>
+          <w:b/>
+          <w:bCs/>
+        </w:rPr>
+      </w:pPr>
+      <w:r>
+        <w:rPr>
+          <w:b/>
+          <w:bCs/>
+        </w:rPr>
+        <w:t>2. Inspection</w:t>
+      </w:r>
+    </w:p>
+    <w:p>
+      <w:r>
+        <w:t>The following files were inspected:</w:t>
+      </w:r>
+    </w:p>
+    <w:p>
+      <w:pPr>
+        <w:numPr>
+          <w:ilvl w:val="0"/>
+          <w:numId w:val="41"/>
+        </w:numPr>
+      </w:pPr>
+      <w:proofErr w:type="spellStart"/>
+      <w:r>
+        <w:t>src</w:t>
+      </w:r>
+      <w:proofErr w:type="spellEnd"/>
+      <w:r>
+        <w:t>/</w:t>
+      </w:r>
+      <w:proofErr w:type="spellStart"/>
+      <w:r>
+        <w:t>db</w:t>
+      </w:r>
+      <w:proofErr w:type="spellEnd"/>
+      <w:r>
+        <w:t>/</w:t>
+      </w:r>
+      <w:proofErr w:type="spellStart"/>
+      <w:r>
+        <w:t>schema.ts</w:t>
+      </w:r>
+      <w:proofErr w:type="spellEnd"/>
+      <w:r>
+        <w:t xml:space="preserve"> — Confirmed that the </w:t>
+      </w:r>
+      <w:proofErr w:type="spellStart"/>
+      <w:r>
+        <w:t>audit_logs</w:t>
+      </w:r>
+      <w:proofErr w:type="spellEnd"/>
+      <w:r>
+        <w:t xml:space="preserve"> table and its columns were defined.</w:t>
+      </w:r>
+    </w:p>
+    <w:p>
+      <w:pPr>
+        <w:numPr>
+          <w:ilvl w:val="0"/>
+          <w:numId w:val="41"/>
+        </w:numPr>
+      </w:pPr>
+      <w:proofErr w:type="spellStart"/>
+      <w:r>
+        <w:t>src</w:t>
+      </w:r>
+      <w:proofErr w:type="spellEnd"/>
+      <w:r>
+        <w:t>/</w:t>
+      </w:r>
+      <w:proofErr w:type="spellStart"/>
+      <w:r>
+        <w:t>db</w:t>
+      </w:r>
+      <w:proofErr w:type="spellEnd"/>
+      <w:r>
+        <w:t>/</w:t>
+      </w:r>
+      <w:proofErr w:type="spellStart"/>
+      <w:r>
+        <w:t>seed.ts</w:t>
+      </w:r>
+      <w:proofErr w:type="spellEnd"/>
+      <w:r>
+        <w:t xml:space="preserve"> — Found four sample audit entries, including </w:t>
+      </w:r>
+      <w:proofErr w:type="spellStart"/>
+      <w:proofErr w:type="gramStart"/>
+      <w:r>
+        <w:t>invoice.paid</w:t>
+      </w:r>
+      <w:proofErr w:type="spellEnd"/>
+      <w:proofErr w:type="gramEnd"/>
+      <w:r>
+        <w:t>. These were seeded records rather than runtime payment logs.</w:t>
+      </w:r>
+    </w:p>
+    <w:p>
+      <w:pPr>
+        <w:numPr>
+          <w:ilvl w:val="0"/>
+          <w:numId w:val="41"/>
+        </w:numPr>
+      </w:pPr>
+      <w:proofErr w:type="spellStart"/>
+      <w:r>
+        <w:t>src</w:t>
+      </w:r>
+      <w:proofErr w:type="spellEnd"/>
+      <w:r>
+        <w:t>/app/</w:t>
+      </w:r>
+      <w:proofErr w:type="spellStart"/>
+      <w:r>
+        <w:t>api</w:t>
+      </w:r>
+      <w:proofErr w:type="spellEnd"/>
+      <w:r>
+        <w:t>/invoices/[id]/</w:t>
+      </w:r>
+      <w:proofErr w:type="spellStart"/>
+      <w:r>
+        <w:t>route.ts</w:t>
+      </w:r>
+      <w:proofErr w:type="spellEnd"/>
+      <w:r>
+        <w:t xml:space="preserve"> — Confirmed that the payment transaction inserted payment records and updated invoice balances and status, but did not previously create audit entries.</w:t>
+      </w:r>
+    </w:p>
+    <w:p>
+      <w:pPr>
+        <w:rPr>
+          <w:b/>
+          <w:bCs/>
+        </w:rPr>
+      </w:pPr>
+      <w:r>
+        <w:rPr>
+          <w:b/>
+          <w:bCs/>
+        </w:rPr>
+        <w:t>3. Verification</w:t>
+      </w:r>
+    </w:p>
+    <w:tbl>
+      <w:tblPr>
+        <w:tblW w:w="0" w:type="auto"/>
+        <w:tblCellSpacing w:w="15" w:type="dxa"/>
+        <w:tblCellMar>
+          <w:top w:w="15" w:type="dxa"/>
+          <w:left w:w="15" w:type="dxa"/>
+          <w:bottom w:w="15" w:type="dxa"/>
+          <w:right w:w="15" w:type="dxa"/>
+        </w:tblCellMar>
+        <w:tblLook w:val="04A0" w:firstRow="1" w:lastRow="0" w:firstColumn="1" w:lastColumn="0" w:noHBand="0" w:noVBand="1"/>
+      </w:tblPr>
+      <w:tblGrid>
+        <w:gridCol w:w="3487"/>
+        <w:gridCol w:w="5873"/>
+      </w:tblGrid>
+      <w:tr>
+        <w:trPr>
+          <w:tblCellSpacing w:w="15" w:type="dxa"/>
+        </w:trPr>
+        <w:tc>
+          <w:tcPr>
+            <w:tcW w:w="0" w:type="auto"/>
+            <w:vAlign w:val="center"/>
+            <w:hideMark/>
+          </w:tcPr>
+          <w:p>
+            <w:pPr>
+              <w:rPr>
+                <w:b/>
+                <w:bCs/>
+              </w:rPr>
+            </w:pPr>
+            <w:r>
+              <w:rPr>
+                <w:b/>
+                <w:bCs/>
+              </w:rPr>
+              <w:t>Test</w:t>
+            </w:r>
+          </w:p>
+        </w:tc>
+        <w:tc>
+          <w:tcPr>
+            <w:tcW w:w="0" w:type="auto"/>
+            <w:vAlign w:val="center"/>
+            <w:hideMark/>
+          </w:tcPr>
+          <w:p>
+            <w:pPr>
+              <w:rPr>
+                <w:b/>
+                <w:bCs/>
+              </w:rPr>
+            </w:pPr>
+            <w:r>
+              <w:rPr>
+                <w:b/>
+                <w:bCs/>
+              </w:rPr>
+              <w:t>Result</w:t>
+            </w:r>
+          </w:p>
+        </w:tc>
+      </w:tr>
+      <w:tr>
+        <w:trPr>
+          <w:tblCellSpacing w:w="15" w:type="dxa"/>
+        </w:trPr>
+        <w:tc>
+          <w:tcPr>
+            <w:tcW w:w="0" w:type="auto"/>
+            <w:vAlign w:val="center"/>
+            <w:hideMark/>
+          </w:tcPr>
+          <w:p>
+            <w:r>
+              <w:t>Audit-log table inspection</w:t>
+            </w:r>
+          </w:p>
+        </w:tc>
+        <w:tc>
+          <w:tcPr>
+            <w:tcW w:w="0" w:type="auto"/>
+            <w:vAlign w:val="center"/>
+            <w:hideMark/>
+          </w:tcPr>
+          <w:p>
+            <w:r>
+              <w:t>Passed — Table and required fields exist</w:t>
+            </w:r>
+          </w:p>
+        </w:tc>
+      </w:tr>
+      <w:tr>
+        <w:trPr>
+          <w:tblCellSpacing w:w="15" w:type="dxa"/>
+        </w:trPr>
+        <w:tc>
+          <w:tcPr>
+            <w:tcW w:w="0" w:type="auto"/>
+            <w:vAlign w:val="center"/>
+            <w:hideMark/>
+          </w:tcPr>
+          <w:p>
+            <w:r>
+              <w:t>Search for runtime audit logging</w:t>
+            </w:r>
+          </w:p>
+        </w:tc>
+        <w:tc>
+          <w:tcPr>
+            <w:tcW w:w="0" w:type="auto"/>
+            <w:vAlign w:val="center"/>
+            <w:hideMark/>
+          </w:tcPr>
+          <w:p>
+            <w:r>
+              <w:t>Gap confirmed — No audit insertion found in the payment API</w:t>
+            </w:r>
+          </w:p>
+        </w:tc>
+      </w:tr>
+      <w:tr>
+        <w:trPr>
+          <w:tblCellSpacing w:w="15" w:type="dxa"/>
+        </w:trPr>
+        <w:tc>
+          <w:tcPr>
+            <w:tcW w:w="0" w:type="auto"/>
+            <w:vAlign w:val="center"/>
+            <w:hideMark/>
+          </w:tcPr>
+          <w:p>
+            <w:r>
+              <w:t>TypeScript check after implementation</w:t>
+            </w:r>
+          </w:p>
+        </w:tc>
+        <w:tc>
+          <w:tcPr>
+            <w:tcW w:w="0" w:type="auto"/>
+            <w:vAlign w:val="center"/>
+            <w:hideMark/>
+          </w:tcPr>
+          <w:p>
+            <w:r>
+              <w:t xml:space="preserve">Passed — </w:t>
+            </w:r>
+            <w:proofErr w:type="spellStart"/>
+            <w:r>
+              <w:t>npx</w:t>
+            </w:r>
+            <w:proofErr w:type="spellEnd"/>
+            <w:r>
+              <w:t xml:space="preserve"> </w:t>
+            </w:r>
+            <w:proofErr w:type="spellStart"/>
+            <w:r>
+              <w:t>tsc</w:t>
+            </w:r>
+            <w:proofErr w:type="spellEnd"/>
+            <w:r>
+              <w:t xml:space="preserve"> --</w:t>
+            </w:r>
+            <w:proofErr w:type="spellStart"/>
+            <w:r>
+              <w:t>noEmit</w:t>
+            </w:r>
+            <w:proofErr w:type="spellEnd"/>
+          </w:p>
+        </w:tc>
+      </w:tr>
+      <w:tr>
+        <w:trPr>
+          <w:tblCellSpacing w:w="15" w:type="dxa"/>
+        </w:trPr>
+        <w:tc>
+          <w:tcPr>
+            <w:tcW w:w="0" w:type="auto"/>
+            <w:vAlign w:val="center"/>
+            <w:hideMark/>
+          </w:tcPr>
+          <w:p>
+            <w:r>
+              <w:t>Partial payment test</w:t>
+            </w:r>
+          </w:p>
+        </w:tc>
+        <w:tc>
+          <w:tcPr>
+            <w:tcW w:w="0" w:type="auto"/>
+            <w:vAlign w:val="center"/>
+            <w:hideMark/>
+          </w:tcPr>
+          <w:p>
+            <w:r>
+              <w:t>Passed — Payment succeeded and invoice balance updated correctly</w:t>
+            </w:r>
+          </w:p>
+        </w:tc>
+      </w:tr>
+      <w:tr>
+        <w:trPr>
+          <w:tblCellSpacing w:w="15" w:type="dxa"/>
+        </w:trPr>
+        <w:tc>
+          <w:tcPr>
+            <w:tcW w:w="0" w:type="auto"/>
+            <w:vAlign w:val="center"/>
+            <w:hideMark/>
+          </w:tcPr>
+          <w:p>
+            <w:r>
+              <w:t>Final payment audit event</w:t>
+            </w:r>
+          </w:p>
+        </w:tc>
+        <w:tc>
+          <w:tcPr>
+            <w:tcW w:w="0" w:type="auto"/>
+            <w:vAlign w:val="center"/>
+            <w:hideMark/>
+          </w:tcPr>
+          <w:p>
+            <w:r>
+              <w:t>Not yet verified</w:t>
+            </w:r>
+          </w:p>
+        </w:tc>
+      </w:tr>
+    </w:tbl>
+    <w:p>
+      <w:pPr>
+        <w:rPr>
+          <w:b/>
+          <w:bCs/>
+        </w:rPr>
+      </w:pPr>
+      <w:r>
+        <w:rPr>
+          <w:b/>
+          <w:bCs/>
+        </w:rPr>
+        <w:t>4. Work Performed</w:t>
+      </w:r>
+    </w:p>
+    <w:p>
+      <w:r>
+        <w:t xml:space="preserve">Updated </w:t>
+      </w:r>
+      <w:proofErr w:type="spellStart"/>
+      <w:r>
+        <w:t>src</w:t>
+      </w:r>
+      <w:proofErr w:type="spellEnd"/>
+      <w:r>
+        <w:t>/app/</w:t>
+      </w:r>
+      <w:proofErr w:type="spellStart"/>
+      <w:r>
+        <w:t>api</w:t>
+      </w:r>
+      <w:proofErr w:type="spellEnd"/>
+      <w:r>
+        <w:t>/invoices/[id]/</w:t>
+      </w:r>
+      <w:proofErr w:type="spellStart"/>
+      <w:r>
+        <w:t>route.ts</w:t>
+      </w:r>
+      <w:proofErr w:type="spellEnd"/>
+      <w:r>
+        <w:t>.</w:t>
+      </w:r>
+    </w:p>
+    <w:p>
+      <w:pPr>
+        <w:numPr>
+          <w:ilvl w:val="0"/>
+          <w:numId w:val="42"/>
+        </w:numPr>
+      </w:pPr>
+      <w:r>
+        <w:t xml:space="preserve">Imported </w:t>
+      </w:r>
+      <w:proofErr w:type="spellStart"/>
+      <w:r>
+        <w:t>auditLogs</w:t>
+      </w:r>
+      <w:proofErr w:type="spellEnd"/>
+      <w:r>
+        <w:t xml:space="preserve"> from the database schema.</w:t>
+      </w:r>
+    </w:p>
+    <w:p>
+      <w:pPr>
+        <w:numPr>
+          <w:ilvl w:val="0"/>
+          <w:numId w:val="42"/>
+        </w:numPr>
+      </w:pPr>
+      <w:r>
+        <w:t xml:space="preserve">Added an </w:t>
+      </w:r>
+      <w:proofErr w:type="spellStart"/>
+      <w:proofErr w:type="gramStart"/>
+      <w:r>
+        <w:t>invoice.payment</w:t>
+      </w:r>
+      <w:proofErr w:type="gramEnd"/>
+      <w:r>
+        <w:t>_recorded</w:t>
+      </w:r>
+      <w:proofErr w:type="spellEnd"/>
+      <w:r>
+        <w:t xml:space="preserve"> audit entry for every recorded payment, including partial payments.</w:t>
+      </w:r>
+    </w:p>
+    <w:p>
+      <w:pPr>
+        <w:numPr>
+          <w:ilvl w:val="0"/>
+          <w:numId w:val="42"/>
+        </w:numPr>
+      </w:pPr>
+      <w:r>
+        <w:t xml:space="preserve">Added an </w:t>
+      </w:r>
+      <w:proofErr w:type="spellStart"/>
+      <w:proofErr w:type="gramStart"/>
+      <w:r>
+        <w:t>invoice.paid</w:t>
+      </w:r>
+      <w:proofErr w:type="spellEnd"/>
+      <w:proofErr w:type="gramEnd"/>
+      <w:r>
+        <w:t xml:space="preserve"> audit entry when a payment completes the invoice.</w:t>
+      </w:r>
+    </w:p>
+    <w:p>
+      <w:pPr>
+        <w:numPr>
+          <w:ilvl w:val="0"/>
+          <w:numId w:val="42"/>
+        </w:numPr>
+      </w:pPr>
+      <w:r>
+        <w:lastRenderedPageBreak/>
+        <w:t>Included payment amount, method, reference, updated paid amount, and invoice status in the audit metadata where applicable.</w:t>
+      </w:r>
+    </w:p>
+    <w:p>
+      <w:pPr>
+        <w:numPr>
+          <w:ilvl w:val="0"/>
+          <w:numId w:val="42"/>
+        </w:numPr>
+      </w:pPr>
+      <w:r>
+        <w:t>Placed audit-log insertions inside the existing database transaction so payment records, invoice updates, and audit entries are committed together.</w:t>
+      </w:r>
+    </w:p>
+    <w:p>
+      <w:pPr>
+        <w:rPr>
+          <w:b/>
+          <w:bCs/>
+        </w:rPr>
+      </w:pPr>
+      <w:r>
+        <w:rPr>
+          <w:b/>
+          <w:bCs/>
+        </w:rPr>
+        <w:t>5. Conclusion and Limitations</w:t>
+      </w:r>
+    </w:p>
+    <w:p>
+      <w:r>
+        <w:t>The runtime payment audit-logging gap has been addressed in the invoice payment API.</w:t>
+      </w:r>
+    </w:p>
+    <w:p>
+      <w:r>
+        <w:t>The partial-payment test confirmed that a payment can still be recorded successfully and the remaining invoice balance is updated correctly. The TypeScript check also passed.</w:t>
+      </w:r>
+    </w:p>
+    <w:p>
+      <w:r>
+        <w:t>The final-payment audit event and the resulting database records have not yet been independently verified. The implementation currently records payment activity in the database; an audit-log retrieval interface or timeline has not been established as part of this finding.</w:t>
+      </w:r>
+    </w:p>
+    <w:p>
+      <w:r>
+        <w:rPr>
+          <w:b/>
+          <w:bCs/>
+        </w:rPr>
+        <w:t>Next action:</w:t>
+      </w:r>
+      <w:r>
+        <w:t xml:space="preserve"> Verify the audit records for partial and final payments in the database before marking all payment-audit behavior fully tested.</w:t>
+      </w:r>
+    </w:p>
+    <w:p>
+      <w:pPr>
+        <w:rPr>
+          <w:b/>
+          <w:bCs/>
+        </w:rPr>
+      </w:pPr>
+      <w:r>
+        <w:rPr>
+          <w:b/>
+          <w:bCs/>
+        </w:rPr>
+        <w:t>Audit Summary</w:t>
+      </w:r>
+    </w:p>
+    <w:tbl>
+      <w:tblPr>
+        <w:tblW w:w="0" w:type="auto"/>
+        <w:tblCellSpacing w:w="15" w:type="dxa"/>
+        <w:tblCellMar>
+          <w:top w:w="15" w:type="dxa"/>
+          <w:left w:w="15" w:type="dxa"/>
+          <w:bottom w:w="15" w:type="dxa"/>
+          <w:right w:w="15" w:type="dxa"/>
+        </w:tblCellMar>
+        <w:tblLook w:val="04A0" w:firstRow="1" w:lastRow="0" w:firstColumn="1" w:lastColumn="0" w:noHBand="0" w:noVBand="1"/>
+      </w:tblPr>
+      <w:tblGrid>
+        <w:gridCol w:w="2846"/>
+        <w:gridCol w:w="2770"/>
+      </w:tblGrid>
+      <w:tr>
+        <w:trPr>
+          <w:tblCellSpacing w:w="15" w:type="dxa"/>
+        </w:trPr>
+        <w:tc>
+          <w:tcPr>
+            <w:tcW w:w="0" w:type="auto"/>
+            <w:vAlign w:val="center"/>
+            <w:hideMark/>
+          </w:tcPr>
+          <w:p>
+            <w:pPr>
+              <w:rPr>
+                <w:b/>
+                <w:bCs/>
+              </w:rPr>
+            </w:pPr>
+            <w:r>
+              <w:rPr>
+                <w:b/>
+                <w:bCs/>
+              </w:rPr>
+              <w:t>Audit Item</w:t>
+            </w:r>
+          </w:p>
+        </w:tc>
+        <w:tc>
+          <w:tcPr>
+            <w:tcW w:w="0" w:type="auto"/>
+            <w:vAlign w:val="center"/>
+            <w:hideMark/>
+          </w:tcPr>
+          <w:p>
+            <w:pPr>
+              <w:rPr>
+                <w:b/>
+                <w:bCs/>
+              </w:rPr>
+            </w:pPr>
+            <w:r>
+              <w:rPr>
+                <w:b/>
+                <w:bCs/>
+              </w:rPr>
+              <w:t>Evidence-Based Conclusion</w:t>
+            </w:r>
+          </w:p>
+        </w:tc>
+      </w:tr>
+      <w:tr>
+        <w:trPr>
+          <w:tblCellSpacing w:w="15" w:type="dxa"/>
+        </w:trPr>
+        <w:tc>
+          <w:tcPr>
+            <w:tcW w:w="0" w:type="auto"/>
+            <w:vAlign w:val="center"/>
+            <w:hideMark/>
+          </w:tcPr>
+          <w:p>
+            <w:r>
+              <w:t>Audit-log database structure</w:t>
+            </w:r>
+          </w:p>
+        </w:tc>
+        <w:tc>
+          <w:tcPr>
+            <w:tcW w:w="0" w:type="auto"/>
+            <w:vAlign w:val="center"/>
+            <w:hideMark/>
+          </w:tcPr>
+          <w:p>
+            <w:r>
+              <w:t>Implemented</w:t>
+            </w:r>
+          </w:p>
+        </w:tc>
+      </w:tr>
+      <w:tr>
+        <w:trPr>
+          <w:tblCellSpacing w:w="15" w:type="dxa"/>
+        </w:trPr>
+        <w:tc>
+          <w:tcPr>
+            <w:tcW w:w="0" w:type="auto"/>
+            <w:vAlign w:val="center"/>
+            <w:hideMark/>
+          </w:tcPr>
+          <w:p>
+            <w:r>
+              <w:t>Sample audit entries</w:t>
+            </w:r>
+          </w:p>
+        </w:tc>
+        <w:tc>
+          <w:tcPr>
+            <w:tcW w:w="0" w:type="auto"/>
+            <w:vAlign w:val="center"/>
+            <w:hideMark/>
+          </w:tcPr>
+          <w:p>
+            <w:r>
+              <w:t>Present in seed data</w:t>
+            </w:r>
+          </w:p>
+        </w:tc>
+      </w:tr>
+      <w:tr>
+        <w:trPr>
+          <w:tblCellSpacing w:w="15" w:type="dxa"/>
+        </w:trPr>
+        <w:tc>
+          <w:tcPr>
+            <w:tcW w:w="0" w:type="auto"/>
+            <w:vAlign w:val="center"/>
+            <w:hideMark/>
+          </w:tcPr>
+          <w:p>
+            <w:r>
+              <w:t>Runtime payment logging</w:t>
+            </w:r>
+          </w:p>
+        </w:tc>
+        <w:tc>
+          <w:tcPr>
+            <w:tcW w:w="0" w:type="auto"/>
+            <w:vAlign w:val="center"/>
+            <w:hideMark/>
+          </w:tcPr>
+          <w:p>
+            <w:r>
+              <w:t>Implemented</w:t>
+            </w:r>
+          </w:p>
+        </w:tc>
+      </w:tr>
+      <w:tr>
+        <w:trPr>
+          <w:tblCellSpacing w:w="15" w:type="dxa"/>
+        </w:trPr>
+        <w:tc>
+          <w:tcPr>
+            <w:tcW w:w="0" w:type="auto"/>
+            <w:vAlign w:val="center"/>
+            <w:hideMark/>
+          </w:tcPr>
+          <w:p>
+            <w:r>
+              <w:t>Partial payment behavior</w:t>
+            </w:r>
+          </w:p>
+        </w:tc>
+        <w:tc>
+          <w:tcPr>
+            <w:tcW w:w="0" w:type="auto"/>
+            <w:vAlign w:val="center"/>
+            <w:hideMark/>
+          </w:tcPr>
+          <w:p>
+            <w:r>
+              <w:t>Verified</w:t>
+            </w:r>
+          </w:p>
+        </w:tc>
+      </w:tr>
+      <w:tr>
+        <w:trPr>
+          <w:tblCellSpacing w:w="15" w:type="dxa"/>
+        </w:trPr>
+        <w:tc>
+          <w:tcPr>
+            <w:tcW w:w="0" w:type="auto"/>
+            <w:vAlign w:val="center"/>
+            <w:hideMark/>
+          </w:tcPr>
+          <w:p>
+            <w:r>
+              <w:t>Full payment audit event</w:t>
+            </w:r>
+          </w:p>
+        </w:tc>
+        <w:tc>
+          <w:tcPr>
+            <w:tcW w:w="0" w:type="auto"/>
+            <w:vAlign w:val="center"/>
+            <w:hideMark/>
+          </w:tcPr>
+          <w:p>
+            <w:r>
+              <w:t>Pending verification</w:t>
+            </w:r>
+          </w:p>
+        </w:tc>
+      </w:tr>
+      <w:tr>
+        <w:trPr>
+          <w:tblCellSpacing w:w="15" w:type="dxa"/>
+        </w:trPr>
+        <w:tc>
+          <w:tcPr>
+            <w:tcW w:w="0" w:type="auto"/>
+            <w:vAlign w:val="center"/>
+            <w:hideMark/>
+          </w:tcPr>
+          <w:p>
+            <w:r>
+              <w:t>Audit-log display interface</w:t>
+            </w:r>
+          </w:p>
+        </w:tc>
+        <w:tc>
+          <w:tcPr>
+            <w:tcW w:w="0" w:type="auto"/>
+            <w:vAlign w:val="center"/>
+            <w:hideMark/>
+          </w:tcPr>
+          <w:p>
+            <w:r>
+              <w:t>Not established</w:t>
+            </w:r>
+          </w:p>
+        </w:tc>
+      </w:tr>
+    </w:tbl>
+    <w:p/>
     <w:sectPr>
       <w:pgSz w:w="12240" w:h="15840"/>
       <w:pgMar w:top="1440" w:right="1440" w:bottom="1440" w:left="1440" w:header="720" w:footer="720" w:gutter="0"/>
@@ -9794,6 +11731,155 @@
     </w:lvl>
   </w:abstractNum>
   <w:abstractNum w:abstractNumId="7" w15:restartNumberingAfterBreak="0">
+    <w:nsid w:val="21B71FF6"/>
+    <w:multiLevelType w:val="multilevel"/>
+    <w:tmpl w:val="BD9CAF84"/>
+    <w:lvl w:ilvl="0">
+      <w:start w:val="1"/>
+      <w:numFmt w:val="bullet"/>
+      <w:lvlText w:val=""/>
+      <w:lvlJc w:val="left"/>
+      <w:pPr>
+        <w:tabs>
+          <w:tab w:val="num" w:pos="720"/>
+        </w:tabs>
+        <w:ind w:left="720" w:hanging="360"/>
+      </w:pPr>
+      <w:rPr>
+        <w:rFonts w:ascii="Symbol" w:hAnsi="Symbol" w:hint="default"/>
+        <w:sz w:val="20"/>
+      </w:rPr>
+    </w:lvl>
+    <w:lvl w:ilvl="1" w:tentative="1">
+      <w:start w:val="1"/>
+      <w:numFmt w:val="bullet"/>
+      <w:lvlText w:val="o"/>
+      <w:lvlJc w:val="left"/>
+      <w:pPr>
+        <w:tabs>
+          <w:tab w:val="num" w:pos="1440"/>
+        </w:tabs>
+        <w:ind w:left="1440" w:hanging="360"/>
+      </w:pPr>
+      <w:rPr>
+        <w:rFonts w:ascii="Courier New" w:hAnsi="Courier New" w:hint="default"/>
+        <w:sz w:val="20"/>
+      </w:rPr>
+    </w:lvl>
+    <w:lvl w:ilvl="2" w:tentative="1">
+      <w:start w:val="1"/>
+      <w:numFmt w:val="bullet"/>
+      <w:lvlText w:val=""/>
+      <w:lvlJc w:val="left"/>
+      <w:pPr>
+        <w:tabs>
+          <w:tab w:val="num" w:pos="2160"/>
+        </w:tabs>
+        <w:ind w:left="2160" w:hanging="360"/>
+      </w:pPr>
+      <w:rPr>
+        <w:rFonts w:ascii="Wingdings" w:hAnsi="Wingdings" w:hint="default"/>
+        <w:sz w:val="20"/>
+      </w:rPr>
+    </w:lvl>
+    <w:lvl w:ilvl="3" w:tentative="1">
+      <w:start w:val="1"/>
+      <w:numFmt w:val="bullet"/>
+      <w:lvlText w:val=""/>
+      <w:lvlJc w:val="left"/>
+      <w:pPr>
+        <w:tabs>
+          <w:tab w:val="num" w:pos="2880"/>
+        </w:tabs>
+        <w:ind w:left="2880" w:hanging="360"/>
+      </w:pPr>
+      <w:rPr>
+        <w:rFonts w:ascii="Wingdings" w:hAnsi="Wingdings" w:hint="default"/>
+        <w:sz w:val="20"/>
+      </w:rPr>
+    </w:lvl>
+    <w:lvl w:ilvl="4" w:tentative="1">
+      <w:start w:val="1"/>
+      <w:numFmt w:val="bullet"/>
+      <w:lvlText w:val=""/>
+      <w:lvlJc w:val="left"/>
+      <w:pPr>
+        <w:tabs>
+          <w:tab w:val="num" w:pos="3600"/>
+        </w:tabs>
+        <w:ind w:left="3600" w:hanging="360"/>
+      </w:pPr>
+      <w:rPr>
+        <w:rFonts w:ascii="Wingdings" w:hAnsi="Wingdings" w:hint="default"/>
+        <w:sz w:val="20"/>
+      </w:rPr>
+    </w:lvl>
+    <w:lvl w:ilvl="5" w:tentative="1">
+      <w:start w:val="1"/>
+      <w:numFmt w:val="bullet"/>
+      <w:lvlText w:val=""/>
+      <w:lvlJc w:val="left"/>
+      <w:pPr>
+        <w:tabs>
+          <w:tab w:val="num" w:pos="4320"/>
+        </w:tabs>
+        <w:ind w:left="4320" w:hanging="360"/>
+      </w:pPr>
+      <w:rPr>
+        <w:rFonts w:ascii="Wingdings" w:hAnsi="Wingdings" w:hint="default"/>
+        <w:sz w:val="20"/>
+      </w:rPr>
+    </w:lvl>
+    <w:lvl w:ilvl="6" w:tentative="1">
+      <w:start w:val="1"/>
+      <w:numFmt w:val="bullet"/>
+      <w:lvlText w:val=""/>
+      <w:lvlJc w:val="left"/>
+      <w:pPr>
+        <w:tabs>
+          <w:tab w:val="num" w:pos="5040"/>
+        </w:tabs>
+        <w:ind w:left="5040" w:hanging="360"/>
+      </w:pPr>
+      <w:rPr>
+        <w:rFonts w:ascii="Wingdings" w:hAnsi="Wingdings" w:hint="default"/>
+        <w:sz w:val="20"/>
+      </w:rPr>
+    </w:lvl>
+    <w:lvl w:ilvl="7" w:tentative="1">
+      <w:start w:val="1"/>
+      <w:numFmt w:val="bullet"/>
+      <w:lvlText w:val=""/>
+      <w:lvlJc w:val="left"/>
+      <w:pPr>
+        <w:tabs>
+          <w:tab w:val="num" w:pos="5760"/>
+        </w:tabs>
+        <w:ind w:left="5760" w:hanging="360"/>
+      </w:pPr>
+      <w:rPr>
+        <w:rFonts w:ascii="Wingdings" w:hAnsi="Wingdings" w:hint="default"/>
+        <w:sz w:val="20"/>
+      </w:rPr>
+    </w:lvl>
+    <w:lvl w:ilvl="8" w:tentative="1">
+      <w:start w:val="1"/>
+      <w:numFmt w:val="bullet"/>
+      <w:lvlText w:val=""/>
+      <w:lvlJc w:val="left"/>
+      <w:pPr>
+        <w:tabs>
+          <w:tab w:val="num" w:pos="6480"/>
+        </w:tabs>
+        <w:ind w:left="6480" w:hanging="360"/>
+      </w:pPr>
+      <w:rPr>
+        <w:rFonts w:ascii="Wingdings" w:hAnsi="Wingdings" w:hint="default"/>
+        <w:sz w:val="20"/>
+      </w:rPr>
+    </w:lvl>
+  </w:abstractNum>
+  <w:abstractNum w:abstractNumId="8" w15:restartNumberingAfterBreak="0">
     <w:nsid w:val="22D872D5"/>
     <w:multiLevelType w:val="multilevel"/>
     <w:tmpl w:val="563EF998"/>
@@ -9942,7 +12028,7 @@
       </w:rPr>
     </w:lvl>
   </w:abstractNum>
-  <w:abstractNum w:abstractNumId="8" w15:restartNumberingAfterBreak="0">
+  <w:abstractNum w:abstractNumId="9" w15:restartNumberingAfterBreak="0">
     <w:nsid w:val="2647274E"/>
     <w:multiLevelType w:val="multilevel"/>
     <w:tmpl w:val="13144B14"/>
@@ -10091,7 +12177,7 @@
       </w:rPr>
     </w:lvl>
   </w:abstractNum>
-  <w:abstractNum w:abstractNumId="9" w15:restartNumberingAfterBreak="0">
+  <w:abstractNum w:abstractNumId="10" w15:restartNumberingAfterBreak="0">
     <w:nsid w:val="2E0B23A5"/>
     <w:multiLevelType w:val="multilevel"/>
     <w:tmpl w:val="615C5B1C"/>
@@ -10240,7 +12326,7 @@
       </w:rPr>
     </w:lvl>
   </w:abstractNum>
-  <w:abstractNum w:abstractNumId="10" w15:restartNumberingAfterBreak="0">
+  <w:abstractNum w:abstractNumId="11" w15:restartNumberingAfterBreak="0">
     <w:nsid w:val="311F3557"/>
     <w:multiLevelType w:val="multilevel"/>
     <w:tmpl w:val="1F00C274"/>
@@ -10389,7 +12475,7 @@
       </w:rPr>
     </w:lvl>
   </w:abstractNum>
-  <w:abstractNum w:abstractNumId="11" w15:restartNumberingAfterBreak="0">
+  <w:abstractNum w:abstractNumId="12" w15:restartNumberingAfterBreak="0">
     <w:nsid w:val="336D11D6"/>
     <w:multiLevelType w:val="multilevel"/>
     <w:tmpl w:val="CB0AF25C"/>
@@ -10538,7 +12624,7 @@
       </w:rPr>
     </w:lvl>
   </w:abstractNum>
-  <w:abstractNum w:abstractNumId="12" w15:restartNumberingAfterBreak="0">
+  <w:abstractNum w:abstractNumId="13" w15:restartNumberingAfterBreak="0">
     <w:nsid w:val="341074F8"/>
     <w:multiLevelType w:val="multilevel"/>
     <w:tmpl w:val="4C0845DE"/>
@@ -10687,7 +12773,7 @@
       </w:rPr>
     </w:lvl>
   </w:abstractNum>
-  <w:abstractNum w:abstractNumId="13" w15:restartNumberingAfterBreak="0">
+  <w:abstractNum w:abstractNumId="14" w15:restartNumberingAfterBreak="0">
     <w:nsid w:val="34320D9D"/>
     <w:multiLevelType w:val="multilevel"/>
     <w:tmpl w:val="E14486C4"/>
@@ -10836,7 +12922,7 @@
       </w:rPr>
     </w:lvl>
   </w:abstractNum>
-  <w:abstractNum w:abstractNumId="14" w15:restartNumberingAfterBreak="0">
+  <w:abstractNum w:abstractNumId="15" w15:restartNumberingAfterBreak="0">
     <w:nsid w:val="3EC24B71"/>
     <w:multiLevelType w:val="multilevel"/>
     <w:tmpl w:val="D16A83FE"/>
@@ -10985,7 +13071,7 @@
       </w:rPr>
     </w:lvl>
   </w:abstractNum>
-  <w:abstractNum w:abstractNumId="15" w15:restartNumberingAfterBreak="0">
+  <w:abstractNum w:abstractNumId="16" w15:restartNumberingAfterBreak="0">
     <w:nsid w:val="3FED1BE9"/>
     <w:multiLevelType w:val="multilevel"/>
     <w:tmpl w:val="F020B4B6"/>
@@ -11134,7 +13220,7 @@
       </w:rPr>
     </w:lvl>
   </w:abstractNum>
-  <w:abstractNum w:abstractNumId="16" w15:restartNumberingAfterBreak="0">
+  <w:abstractNum w:abstractNumId="17" w15:restartNumberingAfterBreak="0">
     <w:nsid w:val="420741C5"/>
     <w:multiLevelType w:val="multilevel"/>
     <w:tmpl w:val="ADF8951A"/>
@@ -11283,7 +13369,7 @@
       </w:rPr>
     </w:lvl>
   </w:abstractNum>
-  <w:abstractNum w:abstractNumId="17" w15:restartNumberingAfterBreak="0">
+  <w:abstractNum w:abstractNumId="18" w15:restartNumberingAfterBreak="0">
     <w:nsid w:val="456B647E"/>
     <w:multiLevelType w:val="multilevel"/>
     <w:tmpl w:val="207E01CA"/>
@@ -11432,7 +13518,7 @@
       </w:rPr>
     </w:lvl>
   </w:abstractNum>
-  <w:abstractNum w:abstractNumId="18" w15:restartNumberingAfterBreak="0">
+  <w:abstractNum w:abstractNumId="19" w15:restartNumberingAfterBreak="0">
     <w:nsid w:val="49550C8C"/>
     <w:multiLevelType w:val="multilevel"/>
     <w:tmpl w:val="280219DE"/>
@@ -11581,7 +13667,7 @@
       </w:rPr>
     </w:lvl>
   </w:abstractNum>
-  <w:abstractNum w:abstractNumId="19" w15:restartNumberingAfterBreak="0">
+  <w:abstractNum w:abstractNumId="20" w15:restartNumberingAfterBreak="0">
     <w:nsid w:val="49BC03F4"/>
     <w:multiLevelType w:val="multilevel"/>
     <w:tmpl w:val="AF5C059C"/>
@@ -11694,7 +13780,156 @@
       </w:pPr>
     </w:lvl>
   </w:abstractNum>
-  <w:abstractNum w:abstractNumId="20" w15:restartNumberingAfterBreak="0">
+  <w:abstractNum w:abstractNumId="21" w15:restartNumberingAfterBreak="0">
+    <w:nsid w:val="4B664699"/>
+    <w:multiLevelType w:val="multilevel"/>
+    <w:tmpl w:val="179C3FC8"/>
+    <w:lvl w:ilvl="0">
+      <w:start w:val="1"/>
+      <w:numFmt w:val="bullet"/>
+      <w:lvlText w:val=""/>
+      <w:lvlJc w:val="left"/>
+      <w:pPr>
+        <w:tabs>
+          <w:tab w:val="num" w:pos="720"/>
+        </w:tabs>
+        <w:ind w:left="720" w:hanging="360"/>
+      </w:pPr>
+      <w:rPr>
+        <w:rFonts w:ascii="Symbol" w:hAnsi="Symbol" w:hint="default"/>
+        <w:sz w:val="20"/>
+      </w:rPr>
+    </w:lvl>
+    <w:lvl w:ilvl="1" w:tentative="1">
+      <w:start w:val="1"/>
+      <w:numFmt w:val="bullet"/>
+      <w:lvlText w:val="o"/>
+      <w:lvlJc w:val="left"/>
+      <w:pPr>
+        <w:tabs>
+          <w:tab w:val="num" w:pos="1440"/>
+        </w:tabs>
+        <w:ind w:left="1440" w:hanging="360"/>
+      </w:pPr>
+      <w:rPr>
+        <w:rFonts w:ascii="Courier New" w:hAnsi="Courier New" w:hint="default"/>
+        <w:sz w:val="20"/>
+      </w:rPr>
+    </w:lvl>
+    <w:lvl w:ilvl="2" w:tentative="1">
+      <w:start w:val="1"/>
+      <w:numFmt w:val="bullet"/>
+      <w:lvlText w:val=""/>
+      <w:lvlJc w:val="left"/>
+      <w:pPr>
+        <w:tabs>
+          <w:tab w:val="num" w:pos="2160"/>
+        </w:tabs>
+        <w:ind w:left="2160" w:hanging="360"/>
+      </w:pPr>
+      <w:rPr>
+        <w:rFonts w:ascii="Wingdings" w:hAnsi="Wingdings" w:hint="default"/>
+        <w:sz w:val="20"/>
+      </w:rPr>
+    </w:lvl>
+    <w:lvl w:ilvl="3" w:tentative="1">
+      <w:start w:val="1"/>
+      <w:numFmt w:val="bullet"/>
+      <w:lvlText w:val=""/>
+      <w:lvlJc w:val="left"/>
+      <w:pPr>
+        <w:tabs>
+          <w:tab w:val="num" w:pos="2880"/>
+        </w:tabs>
+        <w:ind w:left="2880" w:hanging="360"/>
+      </w:pPr>
+      <w:rPr>
+        <w:rFonts w:ascii="Wingdings" w:hAnsi="Wingdings" w:hint="default"/>
+        <w:sz w:val="20"/>
+      </w:rPr>
+    </w:lvl>
+    <w:lvl w:ilvl="4" w:tentative="1">
+      <w:start w:val="1"/>
+      <w:numFmt w:val="bullet"/>
+      <w:lvlText w:val=""/>
+      <w:lvlJc w:val="left"/>
+      <w:pPr>
+        <w:tabs>
+          <w:tab w:val="num" w:pos="3600"/>
+        </w:tabs>
+        <w:ind w:left="3600" w:hanging="360"/>
+      </w:pPr>
+      <w:rPr>
+        <w:rFonts w:ascii="Wingdings" w:hAnsi="Wingdings" w:hint="default"/>
+        <w:sz w:val="20"/>
+      </w:rPr>
+    </w:lvl>
+    <w:lvl w:ilvl="5" w:tentative="1">
+      <w:start w:val="1"/>
+      <w:numFmt w:val="bullet"/>
+      <w:lvlText w:val=""/>
+      <w:lvlJc w:val="left"/>
+      <w:pPr>
+        <w:tabs>
+          <w:tab w:val="num" w:pos="4320"/>
+        </w:tabs>
+        <w:ind w:left="4320" w:hanging="360"/>
+      </w:pPr>
+      <w:rPr>
+        <w:rFonts w:ascii="Wingdings" w:hAnsi="Wingdings" w:hint="default"/>
+        <w:sz w:val="20"/>
+      </w:rPr>
+    </w:lvl>
+    <w:lvl w:ilvl="6" w:tentative="1">
+      <w:start w:val="1"/>
+      <w:numFmt w:val="bullet"/>
+      <w:lvlText w:val=""/>
+      <w:lvlJc w:val="left"/>
+      <w:pPr>
+        <w:tabs>
+          <w:tab w:val="num" w:pos="5040"/>
+        </w:tabs>
+        <w:ind w:left="5040" w:hanging="360"/>
+      </w:pPr>
+      <w:rPr>
+        <w:rFonts w:ascii="Wingdings" w:hAnsi="Wingdings" w:hint="default"/>
+        <w:sz w:val="20"/>
+      </w:rPr>
+    </w:lvl>
+    <w:lvl w:ilvl="7" w:tentative="1">
+      <w:start w:val="1"/>
+      <w:numFmt w:val="bullet"/>
+      <w:lvlText w:val=""/>
+      <w:lvlJc w:val="left"/>
+      <w:pPr>
+        <w:tabs>
+          <w:tab w:val="num" w:pos="5760"/>
+        </w:tabs>
+        <w:ind w:left="5760" w:hanging="360"/>
+      </w:pPr>
+      <w:rPr>
+        <w:rFonts w:ascii="Wingdings" w:hAnsi="Wingdings" w:hint="default"/>
+        <w:sz w:val="20"/>
+      </w:rPr>
+    </w:lvl>
+    <w:lvl w:ilvl="8" w:tentative="1">
+      <w:start w:val="1"/>
+      <w:numFmt w:val="bullet"/>
+      <w:lvlText w:val=""/>
+      <w:lvlJc w:val="left"/>
+      <w:pPr>
+        <w:tabs>
+          <w:tab w:val="num" w:pos="6480"/>
+        </w:tabs>
+        <w:ind w:left="6480" w:hanging="360"/>
+      </w:pPr>
+      <w:rPr>
+        <w:rFonts w:ascii="Wingdings" w:hAnsi="Wingdings" w:hint="default"/>
+        <w:sz w:val="20"/>
+      </w:rPr>
+    </w:lvl>
+  </w:abstractNum>
+  <w:abstractNum w:abstractNumId="22" w15:restartNumberingAfterBreak="0">
     <w:nsid w:val="4DC37E5E"/>
     <w:multiLevelType w:val="multilevel"/>
     <w:tmpl w:val="44943224"/>
@@ -11843,7 +14078,7 @@
       </w:rPr>
     </w:lvl>
   </w:abstractNum>
-  <w:abstractNum w:abstractNumId="21" w15:restartNumberingAfterBreak="0">
+  <w:abstractNum w:abstractNumId="23" w15:restartNumberingAfterBreak="0">
     <w:nsid w:val="4EF01481"/>
     <w:multiLevelType w:val="multilevel"/>
     <w:tmpl w:val="A11E9930"/>
@@ -11992,7 +14227,156 @@
       </w:rPr>
     </w:lvl>
   </w:abstractNum>
-  <w:abstractNum w:abstractNumId="22" w15:restartNumberingAfterBreak="0">
+  <w:abstractNum w:abstractNumId="24" w15:restartNumberingAfterBreak="0">
+    <w:nsid w:val="5335728A"/>
+    <w:multiLevelType w:val="multilevel"/>
+    <w:tmpl w:val="BBC4F00C"/>
+    <w:lvl w:ilvl="0">
+      <w:start w:val="1"/>
+      <w:numFmt w:val="bullet"/>
+      <w:lvlText w:val=""/>
+      <w:lvlJc w:val="left"/>
+      <w:pPr>
+        <w:tabs>
+          <w:tab w:val="num" w:pos="720"/>
+        </w:tabs>
+        <w:ind w:left="720" w:hanging="360"/>
+      </w:pPr>
+      <w:rPr>
+        <w:rFonts w:ascii="Symbol" w:hAnsi="Symbol" w:hint="default"/>
+        <w:sz w:val="20"/>
+      </w:rPr>
+    </w:lvl>
+    <w:lvl w:ilvl="1" w:tentative="1">
+      <w:start w:val="1"/>
+      <w:numFmt w:val="bullet"/>
+      <w:lvlText w:val="o"/>
+      <w:lvlJc w:val="left"/>
+      <w:pPr>
+        <w:tabs>
+          <w:tab w:val="num" w:pos="1440"/>
+        </w:tabs>
+        <w:ind w:left="1440" w:hanging="360"/>
+      </w:pPr>
+      <w:rPr>
+        <w:rFonts w:ascii="Courier New" w:hAnsi="Courier New" w:hint="default"/>
+        <w:sz w:val="20"/>
+      </w:rPr>
+    </w:lvl>
+    <w:lvl w:ilvl="2" w:tentative="1">
+      <w:start w:val="1"/>
+      <w:numFmt w:val="bullet"/>
+      <w:lvlText w:val=""/>
+      <w:lvlJc w:val="left"/>
+      <w:pPr>
+        <w:tabs>
+          <w:tab w:val="num" w:pos="2160"/>
+        </w:tabs>
+        <w:ind w:left="2160" w:hanging="360"/>
+      </w:pPr>
+      <w:rPr>
+        <w:rFonts w:ascii="Wingdings" w:hAnsi="Wingdings" w:hint="default"/>
+        <w:sz w:val="20"/>
+      </w:rPr>
+    </w:lvl>
+    <w:lvl w:ilvl="3" w:tentative="1">
+      <w:start w:val="1"/>
+      <w:numFmt w:val="bullet"/>
+      <w:lvlText w:val=""/>
+      <w:lvlJc w:val="left"/>
+      <w:pPr>
+        <w:tabs>
+          <w:tab w:val="num" w:pos="2880"/>
+        </w:tabs>
+        <w:ind w:left="2880" w:hanging="360"/>
+      </w:pPr>
+      <w:rPr>
+        <w:rFonts w:ascii="Wingdings" w:hAnsi="Wingdings" w:hint="default"/>
+        <w:sz w:val="20"/>
+      </w:rPr>
+    </w:lvl>
+    <w:lvl w:ilvl="4" w:tentative="1">
+      <w:start w:val="1"/>
+      <w:numFmt w:val="bullet"/>
+      <w:lvlText w:val=""/>
+      <w:lvlJc w:val="left"/>
+      <w:pPr>
+        <w:tabs>
+          <w:tab w:val="num" w:pos="3600"/>
+        </w:tabs>
+        <w:ind w:left="3600" w:hanging="360"/>
+      </w:pPr>
+      <w:rPr>
+        <w:rFonts w:ascii="Wingdings" w:hAnsi="Wingdings" w:hint="default"/>
+        <w:sz w:val="20"/>
+      </w:rPr>
+    </w:lvl>
+    <w:lvl w:ilvl="5" w:tentative="1">
+      <w:start w:val="1"/>
+      <w:numFmt w:val="bullet"/>
+      <w:lvlText w:val=""/>
+      <w:lvlJc w:val="left"/>
+      <w:pPr>
+        <w:tabs>
+          <w:tab w:val="num" w:pos="4320"/>
+        </w:tabs>
+        <w:ind w:left="4320" w:hanging="360"/>
+      </w:pPr>
+      <w:rPr>
+        <w:rFonts w:ascii="Wingdings" w:hAnsi="Wingdings" w:hint="default"/>
+        <w:sz w:val="20"/>
+      </w:rPr>
+    </w:lvl>
+    <w:lvl w:ilvl="6" w:tentative="1">
+      <w:start w:val="1"/>
+      <w:numFmt w:val="bullet"/>
+      <w:lvlText w:val=""/>
+      <w:lvlJc w:val="left"/>
+      <w:pPr>
+        <w:tabs>
+          <w:tab w:val="num" w:pos="5040"/>
+        </w:tabs>
+        <w:ind w:left="5040" w:hanging="360"/>
+      </w:pPr>
+      <w:rPr>
+        <w:rFonts w:ascii="Wingdings" w:hAnsi="Wingdings" w:hint="default"/>
+        <w:sz w:val="20"/>
+      </w:rPr>
+    </w:lvl>
+    <w:lvl w:ilvl="7" w:tentative="1">
+      <w:start w:val="1"/>
+      <w:numFmt w:val="bullet"/>
+      <w:lvlText w:val=""/>
+      <w:lvlJc w:val="left"/>
+      <w:pPr>
+        <w:tabs>
+          <w:tab w:val="num" w:pos="5760"/>
+        </w:tabs>
+        <w:ind w:left="5760" w:hanging="360"/>
+      </w:pPr>
+      <w:rPr>
+        <w:rFonts w:ascii="Wingdings" w:hAnsi="Wingdings" w:hint="default"/>
+        <w:sz w:val="20"/>
+      </w:rPr>
+    </w:lvl>
+    <w:lvl w:ilvl="8" w:tentative="1">
+      <w:start w:val="1"/>
+      <w:numFmt w:val="bullet"/>
+      <w:lvlText w:val=""/>
+      <w:lvlJc w:val="left"/>
+      <w:pPr>
+        <w:tabs>
+          <w:tab w:val="num" w:pos="6480"/>
+        </w:tabs>
+        <w:ind w:left="6480" w:hanging="360"/>
+      </w:pPr>
+      <w:rPr>
+        <w:rFonts w:ascii="Wingdings" w:hAnsi="Wingdings" w:hint="default"/>
+        <w:sz w:val="20"/>
+      </w:rPr>
+    </w:lvl>
+  </w:abstractNum>
+  <w:abstractNum w:abstractNumId="25" w15:restartNumberingAfterBreak="0">
     <w:nsid w:val="55457C22"/>
     <w:multiLevelType w:val="multilevel"/>
     <w:tmpl w:val="F7866B26"/>
@@ -12141,7 +14525,7 @@
       </w:rPr>
     </w:lvl>
   </w:abstractNum>
-  <w:abstractNum w:abstractNumId="23" w15:restartNumberingAfterBreak="0">
+  <w:abstractNum w:abstractNumId="26" w15:restartNumberingAfterBreak="0">
     <w:nsid w:val="55D93031"/>
     <w:multiLevelType w:val="multilevel"/>
     <w:tmpl w:val="2B4A293A"/>
@@ -12290,7 +14674,7 @@
       </w:rPr>
     </w:lvl>
   </w:abstractNum>
-  <w:abstractNum w:abstractNumId="24" w15:restartNumberingAfterBreak="0">
+  <w:abstractNum w:abstractNumId="27" w15:restartNumberingAfterBreak="0">
     <w:nsid w:val="561F1E6A"/>
     <w:multiLevelType w:val="multilevel"/>
     <w:tmpl w:val="F9861FA0"/>
@@ -12439,7 +14823,7 @@
       </w:rPr>
     </w:lvl>
   </w:abstractNum>
-  <w:abstractNum w:abstractNumId="25" w15:restartNumberingAfterBreak="0">
+  <w:abstractNum w:abstractNumId="28" w15:restartNumberingAfterBreak="0">
     <w:nsid w:val="571927A1"/>
     <w:multiLevelType w:val="multilevel"/>
     <w:tmpl w:val="000E5114"/>
@@ -12588,7 +14972,7 @@
       </w:rPr>
     </w:lvl>
   </w:abstractNum>
-  <w:abstractNum w:abstractNumId="26" w15:restartNumberingAfterBreak="0">
+  <w:abstractNum w:abstractNumId="29" w15:restartNumberingAfterBreak="0">
     <w:nsid w:val="5A257F7A"/>
     <w:multiLevelType w:val="multilevel"/>
     <w:tmpl w:val="6A522DF6"/>
@@ -12737,7 +15121,7 @@
       </w:rPr>
     </w:lvl>
   </w:abstractNum>
-  <w:abstractNum w:abstractNumId="27" w15:restartNumberingAfterBreak="0">
+  <w:abstractNum w:abstractNumId="30" w15:restartNumberingAfterBreak="0">
     <w:nsid w:val="5F7B48E4"/>
     <w:multiLevelType w:val="multilevel"/>
     <w:tmpl w:val="1F5670A6"/>
@@ -12850,7 +15234,7 @@
       </w:pPr>
     </w:lvl>
   </w:abstractNum>
-  <w:abstractNum w:abstractNumId="28" w15:restartNumberingAfterBreak="0">
+  <w:abstractNum w:abstractNumId="31" w15:restartNumberingAfterBreak="0">
     <w:nsid w:val="5FF75A6D"/>
     <w:multiLevelType w:val="multilevel"/>
     <w:tmpl w:val="A0F66E5C"/>
@@ -12999,7 +15383,7 @@
       </w:rPr>
     </w:lvl>
   </w:abstractNum>
-  <w:abstractNum w:abstractNumId="29" w15:restartNumberingAfterBreak="0">
+  <w:abstractNum w:abstractNumId="32" w15:restartNumberingAfterBreak="0">
     <w:nsid w:val="60206D02"/>
     <w:multiLevelType w:val="multilevel"/>
     <w:tmpl w:val="845E9E76"/>
@@ -13148,7 +15532,7 @@
       </w:rPr>
     </w:lvl>
   </w:abstractNum>
-  <w:abstractNum w:abstractNumId="30" w15:restartNumberingAfterBreak="0">
+  <w:abstractNum w:abstractNumId="33" w15:restartNumberingAfterBreak="0">
     <w:nsid w:val="65DE44F2"/>
     <w:multiLevelType w:val="multilevel"/>
     <w:tmpl w:val="8D40347A"/>
@@ -13261,7 +15645,7 @@
       </w:pPr>
     </w:lvl>
   </w:abstractNum>
-  <w:abstractNum w:abstractNumId="31" w15:restartNumberingAfterBreak="0">
+  <w:abstractNum w:abstractNumId="34" w15:restartNumberingAfterBreak="0">
     <w:nsid w:val="6AF17A5A"/>
     <w:multiLevelType w:val="multilevel"/>
     <w:tmpl w:val="40FC88CC"/>
@@ -13410,7 +15794,7 @@
       </w:rPr>
     </w:lvl>
   </w:abstractNum>
-  <w:abstractNum w:abstractNumId="32" w15:restartNumberingAfterBreak="0">
+  <w:abstractNum w:abstractNumId="35" w15:restartNumberingAfterBreak="0">
     <w:nsid w:val="6FC94507"/>
     <w:multiLevelType w:val="multilevel"/>
     <w:tmpl w:val="DAE63DC6"/>
@@ -13559,7 +15943,7 @@
       </w:rPr>
     </w:lvl>
   </w:abstractNum>
-  <w:abstractNum w:abstractNumId="33" w15:restartNumberingAfterBreak="0">
+  <w:abstractNum w:abstractNumId="36" w15:restartNumberingAfterBreak="0">
     <w:nsid w:val="73473A48"/>
     <w:multiLevelType w:val="multilevel"/>
     <w:tmpl w:val="5AF4D1C0"/>
@@ -13708,7 +16092,7 @@
       </w:rPr>
     </w:lvl>
   </w:abstractNum>
-  <w:abstractNum w:abstractNumId="34" w15:restartNumberingAfterBreak="0">
+  <w:abstractNum w:abstractNumId="37" w15:restartNumberingAfterBreak="0">
     <w:nsid w:val="74E13EC7"/>
     <w:multiLevelType w:val="multilevel"/>
     <w:tmpl w:val="477E0E6E"/>
@@ -13857,7 +16241,7 @@
       </w:rPr>
     </w:lvl>
   </w:abstractNum>
-  <w:abstractNum w:abstractNumId="35" w15:restartNumberingAfterBreak="0">
+  <w:abstractNum w:abstractNumId="38" w15:restartNumberingAfterBreak="0">
     <w:nsid w:val="7546600C"/>
     <w:multiLevelType w:val="multilevel"/>
     <w:tmpl w:val="D73828DA"/>
@@ -14006,7 +16390,7 @@
       </w:rPr>
     </w:lvl>
   </w:abstractNum>
-  <w:abstractNum w:abstractNumId="36" w15:restartNumberingAfterBreak="0">
+  <w:abstractNum w:abstractNumId="39" w15:restartNumberingAfterBreak="0">
     <w:nsid w:val="768F2A60"/>
     <w:multiLevelType w:val="multilevel"/>
     <w:tmpl w:val="9B94E488"/>
@@ -14155,7 +16539,7 @@
       </w:rPr>
     </w:lvl>
   </w:abstractNum>
-  <w:abstractNum w:abstractNumId="37" w15:restartNumberingAfterBreak="0">
+  <w:abstractNum w:abstractNumId="40" w15:restartNumberingAfterBreak="0">
     <w:nsid w:val="77A95F60"/>
     <w:multiLevelType w:val="multilevel"/>
     <w:tmpl w:val="7610DC46"/>
@@ -14304,7 +16688,7 @@
       </w:rPr>
     </w:lvl>
   </w:abstractNum>
-  <w:abstractNum w:abstractNumId="38" w15:restartNumberingAfterBreak="0">
+  <w:abstractNum w:abstractNumId="41" w15:restartNumberingAfterBreak="0">
     <w:nsid w:val="7A7111BF"/>
     <w:multiLevelType w:val="multilevel"/>
     <w:tmpl w:val="EA322BA6"/>
@@ -14454,121 +16838,130 @@
     </w:lvl>
   </w:abstractNum>
   <w:num w:numId="1" w16cid:durableId="1222013107">
-    <w:abstractNumId w:val="8"/>
+    <w:abstractNumId w:val="9"/>
   </w:num>
   <w:num w:numId="2" w16cid:durableId="738668883">
-    <w:abstractNumId w:val="21"/>
+    <w:abstractNumId w:val="23"/>
   </w:num>
   <w:num w:numId="3" w16cid:durableId="5791519">
-    <w:abstractNumId w:val="22"/>
+    <w:abstractNumId w:val="25"/>
   </w:num>
   <w:num w:numId="4" w16cid:durableId="674724245">
-    <w:abstractNumId w:val="28"/>
+    <w:abstractNumId w:val="31"/>
   </w:num>
   <w:num w:numId="5" w16cid:durableId="582569914">
     <w:abstractNumId w:val="6"/>
   </w:num>
   <w:num w:numId="6" w16cid:durableId="1345400040">
-    <w:abstractNumId w:val="35"/>
+    <w:abstractNumId w:val="38"/>
   </w:num>
   <w:num w:numId="7" w16cid:durableId="890074338">
     <w:abstractNumId w:val="1"/>
   </w:num>
   <w:num w:numId="8" w16cid:durableId="431704830">
-    <w:abstractNumId w:val="27"/>
+    <w:abstractNumId w:val="30"/>
   </w:num>
   <w:num w:numId="9" w16cid:durableId="1348828581">
-    <w:abstractNumId w:val="16"/>
+    <w:abstractNumId w:val="17"/>
   </w:num>
   <w:num w:numId="10" w16cid:durableId="1938294600">
-    <w:abstractNumId w:val="17"/>
+    <w:abstractNumId w:val="18"/>
   </w:num>
   <w:num w:numId="11" w16cid:durableId="1950699514">
-    <w:abstractNumId w:val="38"/>
+    <w:abstractNumId w:val="41"/>
   </w:num>
   <w:num w:numId="12" w16cid:durableId="518591842">
-    <w:abstractNumId w:val="11"/>
+    <w:abstractNumId w:val="12"/>
   </w:num>
   <w:num w:numId="13" w16cid:durableId="1219171571">
     <w:abstractNumId w:val="2"/>
   </w:num>
   <w:num w:numId="14" w16cid:durableId="840386719">
+    <w:abstractNumId w:val="36"/>
+  </w:num>
+  <w:num w:numId="15" w16cid:durableId="1090853232">
     <w:abstractNumId w:val="33"/>
   </w:num>
-  <w:num w:numId="15" w16cid:durableId="1090853232">
-    <w:abstractNumId w:val="30"/>
-  </w:num>
   <w:num w:numId="16" w16cid:durableId="32849798">
-    <w:abstractNumId w:val="20"/>
+    <w:abstractNumId w:val="22"/>
   </w:num>
   <w:num w:numId="17" w16cid:durableId="1398898140">
-    <w:abstractNumId w:val="13"/>
+    <w:abstractNumId w:val="14"/>
   </w:num>
   <w:num w:numId="18" w16cid:durableId="520512773">
     <w:abstractNumId w:val="0"/>
   </w:num>
   <w:num w:numId="19" w16cid:durableId="1353873044">
-    <w:abstractNumId w:val="19"/>
+    <w:abstractNumId w:val="20"/>
   </w:num>
   <w:num w:numId="20" w16cid:durableId="1732577872">
-    <w:abstractNumId w:val="25"/>
+    <w:abstractNumId w:val="28"/>
   </w:num>
   <w:num w:numId="21" w16cid:durableId="1584337216">
-    <w:abstractNumId w:val="24"/>
+    <w:abstractNumId w:val="27"/>
   </w:num>
   <w:num w:numId="22" w16cid:durableId="1827354818">
-    <w:abstractNumId w:val="36"/>
+    <w:abstractNumId w:val="39"/>
   </w:num>
   <w:num w:numId="23" w16cid:durableId="88545699">
     <w:abstractNumId w:val="5"/>
   </w:num>
   <w:num w:numId="24" w16cid:durableId="1403869803">
-    <w:abstractNumId w:val="9"/>
+    <w:abstractNumId w:val="10"/>
   </w:num>
   <w:num w:numId="25" w16cid:durableId="297535257">
+    <w:abstractNumId w:val="40"/>
+  </w:num>
+  <w:num w:numId="26" w16cid:durableId="61756473">
     <w:abstractNumId w:val="37"/>
   </w:num>
-  <w:num w:numId="26" w16cid:durableId="61756473">
-    <w:abstractNumId w:val="34"/>
-  </w:num>
   <w:num w:numId="27" w16cid:durableId="941886710">
-    <w:abstractNumId w:val="10"/>
+    <w:abstractNumId w:val="11"/>
   </w:num>
   <w:num w:numId="28" w16cid:durableId="1145585058">
-    <w:abstractNumId w:val="29"/>
+    <w:abstractNumId w:val="32"/>
   </w:num>
   <w:num w:numId="29" w16cid:durableId="589044325">
-    <w:abstractNumId w:val="14"/>
+    <w:abstractNumId w:val="15"/>
   </w:num>
   <w:num w:numId="30" w16cid:durableId="43415046">
-    <w:abstractNumId w:val="23"/>
+    <w:abstractNumId w:val="26"/>
   </w:num>
   <w:num w:numId="31" w16cid:durableId="1918516825">
     <w:abstractNumId w:val="4"/>
   </w:num>
   <w:num w:numId="32" w16cid:durableId="2057393325">
-    <w:abstractNumId w:val="7"/>
+    <w:abstractNumId w:val="8"/>
   </w:num>
   <w:num w:numId="33" w16cid:durableId="540825334">
-    <w:abstractNumId w:val="15"/>
+    <w:abstractNumId w:val="16"/>
   </w:num>
   <w:num w:numId="34" w16cid:durableId="770131449">
-    <w:abstractNumId w:val="32"/>
+    <w:abstractNumId w:val="35"/>
   </w:num>
   <w:num w:numId="35" w16cid:durableId="1053238722">
-    <w:abstractNumId w:val="31"/>
+    <w:abstractNumId w:val="34"/>
   </w:num>
   <w:num w:numId="36" w16cid:durableId="1471244015">
-    <w:abstractNumId w:val="18"/>
+    <w:abstractNumId w:val="19"/>
   </w:num>
   <w:num w:numId="37" w16cid:durableId="1715302759">
-    <w:abstractNumId w:val="12"/>
+    <w:abstractNumId w:val="13"/>
   </w:num>
   <w:num w:numId="38" w16cid:durableId="1408723371">
-    <w:abstractNumId w:val="26"/>
+    <w:abstractNumId w:val="29"/>
   </w:num>
   <w:num w:numId="39" w16cid:durableId="1232934499">
     <w:abstractNumId w:val="3"/>
+  </w:num>
+  <w:num w:numId="40" w16cid:durableId="366757332">
+    <w:abstractNumId w:val="21"/>
+  </w:num>
+  <w:num w:numId="41" w16cid:durableId="1736469383">
+    <w:abstractNumId w:val="7"/>
+  </w:num>
+  <w:num w:numId="42" w16cid:durableId="1442995331">
+    <w:abstractNumId w:val="24"/>
   </w:num>
 </w:numbering>
 </file>

</xml_diff>